<commit_message>
docs: improve one-page Word readability
Co-authored-by: McFeel <McFeel@users.noreply.github.com>
</commit_message>
<xml_diff>
--- a/hq-base/nanhang-daxing-mro-20260908/南航大兴维修基地-零碳包装收资清单-一页纸_文秘Codex_20260908.docx
+++ b/hq-base/nanhang-daxing-mro-20260908/南航大兴维修基地-零碳包装收资清单-一页纸_文秘Codex_20260908.docx
@@ -8,6 +8,9 @@
         <w:jc w:val="center"/>
       </w:pPr>
       <w:r>
+        <w:rPr>
+          <w:sz w:val="32"/>
+        </w:rPr>
         <w:t>南航大兴维修基地 · 零碳园区/工厂包装 · 收资清单</w:t>
       </w:r>
     </w:p>
@@ -40,7 +43,7 @@
         <w:rPr>
           <w:b/>
           <w:color w:val="153E65"/>
-          <w:sz w:val="17"/>
+          <w:sz w:val="18"/>
         </w:rPr>
         <w:t>结论先行：请先交必收项；缺用电主体、分项电量、电价、光伏实测，无法建立能碳基线并开展路径比选。本文是收资清单，不是收支报价。</w:t>
       </w:r>
@@ -52,14 +55,14 @@
       <w:r>
         <w:rPr>
           <w:b/>
-          <w:sz w:val="14"/>
+          <w:sz w:val="15"/>
         </w:rPr>
         <w:t>公开已知（仅对表）：</w:t>
       </w:r>
       <w:r>
         <w:rPr>
           <w:color w:val="464E56"/>
-          <w:sz w:val="14"/>
+          <w:sz w:val="15"/>
         </w:rPr>
         <w:t>总建面约108.69万㎡；一期约87.87万㎡、31个单体；维修区约20万㎡；1号机库跨度约405m。以上为公开口径，以贵方资料为准。</w:t>
       </w:r>
@@ -69,6 +72,9 @@
         <w:pStyle w:val="SectionCompact"/>
       </w:pPr>
       <w:r>
+        <w:rPr>
+          <w:sz w:val="20"/>
+        </w:rPr>
         <w:t>必收项</w:t>
       </w:r>
     </w:p>
@@ -98,24 +104,28 @@
             <w:shd w:fill="1F4E78"/>
             <w:vAlign w:val="center"/>
             <w:tcMar>
-              <w:top w:w="35" w:type="dxa"/>
-              <w:start w:w="45" w:type="dxa"/>
-              <w:bottom w:w="35" w:type="dxa"/>
-              <w:end w:w="45" w:type="dxa"/>
+              <w:top w:w="78" w:type="dxa"/>
+              <w:start w:w="55" w:type="dxa"/>
+              <w:bottom w:w="78" w:type="dxa"/>
+              <w:end w:w="55" w:type="dxa"/>
             </w:tcMar>
           </w:tcPr>
           <w:p>
             <w:pPr>
-              <w:spacing w:before="0" w:after="0" w:line="216" w:lineRule="auto"/>
+              <w:spacing w:before="0" w:after="0" w:line="235" w:lineRule="auto"/>
               <w:jc w:val="center"/>
             </w:pPr>
-            <w:r/>
+            <w:r>
+              <w:rPr>
+                <w:sz w:val="15"/>
+              </w:rPr>
+            </w:r>
             <w:r>
               <w:rPr>
                 <w:rFonts w:ascii="Noto Sans CJK SC" w:hAnsi="Noto Sans CJK SC" w:eastAsia="Noto Sans CJK SC"/>
                 <w:b/>
                 <w:color w:val="FFFFFF"/>
-                <w:sz w:val="12"/>
+                <w:sz w:val="15"/>
               </w:rPr>
               <w:t>编号</w:t>
             </w:r>
@@ -127,24 +137,28 @@
             <w:shd w:fill="1F4E78"/>
             <w:vAlign w:val="center"/>
             <w:tcMar>
-              <w:top w:w="35" w:type="dxa"/>
-              <w:start w:w="45" w:type="dxa"/>
-              <w:bottom w:w="35" w:type="dxa"/>
-              <w:end w:w="45" w:type="dxa"/>
+              <w:top w:w="78" w:type="dxa"/>
+              <w:start w:w="55" w:type="dxa"/>
+              <w:bottom w:w="78" w:type="dxa"/>
+              <w:end w:w="55" w:type="dxa"/>
             </w:tcMar>
           </w:tcPr>
           <w:p>
             <w:pPr>
-              <w:spacing w:before="0" w:after="0" w:line="216" w:lineRule="auto"/>
+              <w:spacing w:before="0" w:after="0" w:line="235" w:lineRule="auto"/>
               <w:jc w:val="center"/>
             </w:pPr>
-            <w:r/>
+            <w:r>
+              <w:rPr>
+                <w:sz w:val="15"/>
+              </w:rPr>
+            </w:r>
             <w:r>
               <w:rPr>
                 <w:rFonts w:ascii="Noto Sans CJK SC" w:hAnsi="Noto Sans CJK SC" w:eastAsia="Noto Sans CJK SC"/>
                 <w:b/>
                 <w:color w:val="FFFFFF"/>
-                <w:sz w:val="12"/>
+                <w:sz w:val="15"/>
               </w:rPr>
               <w:t>请提供</w:t>
             </w:r>
@@ -156,24 +170,28 @@
             <w:shd w:fill="1F4E78"/>
             <w:vAlign w:val="center"/>
             <w:tcMar>
-              <w:top w:w="35" w:type="dxa"/>
-              <w:start w:w="45" w:type="dxa"/>
-              <w:bottom w:w="35" w:type="dxa"/>
-              <w:end w:w="45" w:type="dxa"/>
+              <w:top w:w="78" w:type="dxa"/>
+              <w:start w:w="55" w:type="dxa"/>
+              <w:bottom w:w="78" w:type="dxa"/>
+              <w:end w:w="55" w:type="dxa"/>
             </w:tcMar>
           </w:tcPr>
           <w:p>
             <w:pPr>
-              <w:spacing w:before="0" w:after="0" w:line="216" w:lineRule="auto"/>
+              <w:spacing w:before="0" w:after="0" w:line="235" w:lineRule="auto"/>
               <w:jc w:val="center"/>
             </w:pPr>
-            <w:r/>
+            <w:r>
+              <w:rPr>
+                <w:sz w:val="15"/>
+              </w:rPr>
+            </w:r>
             <w:r>
               <w:rPr>
                 <w:rFonts w:ascii="Noto Sans CJK SC" w:hAnsi="Noto Sans CJK SC" w:eastAsia="Noto Sans CJK SC"/>
                 <w:b/>
                 <w:color w:val="FFFFFF"/>
-                <w:sz w:val="12"/>
+                <w:sz w:val="15"/>
               </w:rPr>
               <w:t>用途</w:t>
             </w:r>
@@ -185,24 +203,28 @@
             <w:shd w:fill="1F4E78"/>
             <w:vAlign w:val="center"/>
             <w:tcMar>
-              <w:top w:w="35" w:type="dxa"/>
-              <w:start w:w="45" w:type="dxa"/>
-              <w:bottom w:w="35" w:type="dxa"/>
-              <w:end w:w="45" w:type="dxa"/>
+              <w:top w:w="78" w:type="dxa"/>
+              <w:start w:w="55" w:type="dxa"/>
+              <w:bottom w:w="78" w:type="dxa"/>
+              <w:end w:w="55" w:type="dxa"/>
             </w:tcMar>
           </w:tcPr>
           <w:p>
             <w:pPr>
-              <w:spacing w:before="0" w:after="0" w:line="216" w:lineRule="auto"/>
+              <w:spacing w:before="0" w:after="0" w:line="235" w:lineRule="auto"/>
               <w:jc w:val="center"/>
             </w:pPr>
-            <w:r/>
+            <w:r>
+              <w:rPr>
+                <w:sz w:val="15"/>
+              </w:rPr>
+            </w:r>
             <w:r>
               <w:rPr>
                 <w:rFonts w:ascii="Noto Sans CJK SC" w:hAnsi="Noto Sans CJK SC" w:eastAsia="Noto Sans CJK SC"/>
                 <w:b/>
                 <w:color w:val="FFFFFF"/>
-                <w:sz w:val="12"/>
+                <w:sz w:val="15"/>
               </w:rPr>
               <w:t>格式</w:t>
             </w:r>
@@ -214,24 +236,28 @@
             <w:shd w:fill="1F4E78"/>
             <w:vAlign w:val="center"/>
             <w:tcMar>
-              <w:top w:w="35" w:type="dxa"/>
-              <w:start w:w="45" w:type="dxa"/>
-              <w:bottom w:w="35" w:type="dxa"/>
-              <w:end w:w="45" w:type="dxa"/>
+              <w:top w:w="78" w:type="dxa"/>
+              <w:start w:w="55" w:type="dxa"/>
+              <w:bottom w:w="78" w:type="dxa"/>
+              <w:end w:w="55" w:type="dxa"/>
             </w:tcMar>
           </w:tcPr>
           <w:p>
             <w:pPr>
-              <w:spacing w:before="0" w:after="0" w:line="216" w:lineRule="auto"/>
+              <w:spacing w:before="0" w:after="0" w:line="235" w:lineRule="auto"/>
               <w:jc w:val="center"/>
             </w:pPr>
-            <w:r/>
+            <w:r>
+              <w:rPr>
+                <w:sz w:val="15"/>
+              </w:rPr>
+            </w:r>
             <w:r>
               <w:rPr>
                 <w:rFonts w:ascii="Noto Sans CJK SC" w:hAnsi="Noto Sans CJK SC" w:eastAsia="Noto Sans CJK SC"/>
                 <w:b/>
                 <w:color w:val="FFFFFF"/>
-                <w:sz w:val="12"/>
+                <w:sz w:val="15"/>
               </w:rPr>
               <w:t>缺了会怎样</w:t>
             </w:r>
@@ -247,24 +273,28 @@
             <w:tcW w:type="dxa" w:w="1644"/>
             <w:vAlign w:val="center"/>
             <w:tcMar>
-              <w:top w:w="35" w:type="dxa"/>
-              <w:start w:w="45" w:type="dxa"/>
-              <w:bottom w:w="35" w:type="dxa"/>
-              <w:end w:w="45" w:type="dxa"/>
+              <w:top w:w="78" w:type="dxa"/>
+              <w:start w:w="55" w:type="dxa"/>
+              <w:bottom w:w="78" w:type="dxa"/>
+              <w:end w:w="55" w:type="dxa"/>
             </w:tcMar>
           </w:tcPr>
           <w:p>
             <w:pPr>
-              <w:spacing w:before="0" w:after="0" w:line="216" w:lineRule="auto"/>
+              <w:spacing w:before="0" w:after="0" w:line="235" w:lineRule="auto"/>
               <w:jc w:val="left"/>
             </w:pPr>
-            <w:r/>
+            <w:r>
+              <w:rPr>
+                <w:sz w:val="15"/>
+              </w:rPr>
+            </w:r>
             <w:r>
               <w:rPr>
                 <w:rFonts w:ascii="Noto Sans CJK SC" w:hAnsi="Noto Sans CJK SC" w:eastAsia="Noto Sans CJK SC"/>
                 <w:b/>
                 <w:color w:val="1F2933"/>
-                <w:sz w:val="12"/>
+                <w:sz w:val="15"/>
               </w:rPr>
               <w:t>A1 用电主体与户号</w:t>
             </w:r>
@@ -275,24 +305,28 @@
             <w:tcW w:type="dxa" w:w="3146"/>
             <w:vAlign w:val="center"/>
             <w:tcMar>
-              <w:top w:w="35" w:type="dxa"/>
-              <w:start w:w="45" w:type="dxa"/>
-              <w:bottom w:w="35" w:type="dxa"/>
-              <w:end w:w="45" w:type="dxa"/>
+              <w:top w:w="78" w:type="dxa"/>
+              <w:start w:w="55" w:type="dxa"/>
+              <w:bottom w:w="78" w:type="dxa"/>
+              <w:end w:w="55" w:type="dxa"/>
             </w:tcMar>
           </w:tcPr>
           <w:p>
             <w:pPr>
-              <w:spacing w:before="0" w:after="0" w:line="216" w:lineRule="auto"/>
+              <w:spacing w:before="0" w:after="0" w:line="235" w:lineRule="auto"/>
               <w:jc w:val="left"/>
             </w:pPr>
-            <w:r/>
+            <w:r>
+              <w:rPr>
+                <w:sz w:val="15"/>
+              </w:rPr>
+            </w:r>
             <w:r>
               <w:rPr>
                 <w:rFonts w:ascii="Noto Sans CJK SC" w:hAnsi="Noto Sans CJK SC" w:eastAsia="Noto Sans CJK SC"/>
                 <w:b w:val="0"/>
                 <w:color w:val="1F2933"/>
-                <w:sz w:val="12"/>
+                <w:sz w:val="15"/>
               </w:rPr>
               <w:t>用电户名、户号、计量点及与基地的对应关系</w:t>
             </w:r>
@@ -303,24 +337,28 @@
             <w:tcW w:type="dxa" w:w="1843"/>
             <w:vAlign w:val="center"/>
             <w:tcMar>
-              <w:top w:w="35" w:type="dxa"/>
-              <w:start w:w="45" w:type="dxa"/>
-              <w:bottom w:w="35" w:type="dxa"/>
-              <w:end w:w="45" w:type="dxa"/>
+              <w:top w:w="78" w:type="dxa"/>
+              <w:start w:w="55" w:type="dxa"/>
+              <w:bottom w:w="78" w:type="dxa"/>
+              <w:end w:w="55" w:type="dxa"/>
             </w:tcMar>
           </w:tcPr>
           <w:p>
             <w:pPr>
-              <w:spacing w:before="0" w:after="0" w:line="216" w:lineRule="auto"/>
+              <w:spacing w:before="0" w:after="0" w:line="235" w:lineRule="auto"/>
               <w:jc w:val="left"/>
             </w:pPr>
-            <w:r/>
+            <w:r>
+              <w:rPr>
+                <w:sz w:val="15"/>
+              </w:rPr>
+            </w:r>
             <w:r>
               <w:rPr>
                 <w:rFonts w:ascii="Noto Sans CJK SC" w:hAnsi="Noto Sans CJK SC" w:eastAsia="Noto Sans CJK SC"/>
                 <w:b w:val="0"/>
                 <w:color w:val="1F2933"/>
-                <w:sz w:val="12"/>
+                <w:sz w:val="15"/>
               </w:rPr>
               <w:t>核定能耗归属</w:t>
             </w:r>
@@ -331,24 +369,28 @@
             <w:tcW w:type="dxa" w:w="2353"/>
             <w:vAlign w:val="center"/>
             <w:tcMar>
-              <w:top w:w="35" w:type="dxa"/>
-              <w:start w:w="45" w:type="dxa"/>
-              <w:bottom w:w="35" w:type="dxa"/>
-              <w:end w:w="45" w:type="dxa"/>
+              <w:top w:w="78" w:type="dxa"/>
+              <w:start w:w="55" w:type="dxa"/>
+              <w:bottom w:w="78" w:type="dxa"/>
+              <w:end w:w="55" w:type="dxa"/>
             </w:tcMar>
           </w:tcPr>
           <w:p>
             <w:pPr>
-              <w:spacing w:before="0" w:after="0" w:line="216" w:lineRule="auto"/>
+              <w:spacing w:before="0" w:after="0" w:line="235" w:lineRule="auto"/>
               <w:jc w:val="left"/>
             </w:pPr>
-            <w:r/>
+            <w:r>
+              <w:rPr>
+                <w:sz w:val="15"/>
+              </w:rPr>
+            </w:r>
             <w:r>
               <w:rPr>
                 <w:rFonts w:ascii="Noto Sans CJK SC" w:hAnsi="Noto Sans CJK SC" w:eastAsia="Noto Sans CJK SC"/>
                 <w:b w:val="0"/>
                 <w:color w:val="1F2933"/>
-                <w:sz w:val="12"/>
+                <w:sz w:val="15"/>
               </w:rPr>
               <w:t>户号清单Excel＋近月电费单PDF</w:t>
             </w:r>
@@ -359,24 +401,28 @@
             <w:tcW w:type="dxa" w:w="1843"/>
             <w:vAlign w:val="center"/>
             <w:tcMar>
-              <w:top w:w="35" w:type="dxa"/>
-              <w:start w:w="45" w:type="dxa"/>
-              <w:bottom w:w="35" w:type="dxa"/>
-              <w:end w:w="45" w:type="dxa"/>
+              <w:top w:w="78" w:type="dxa"/>
+              <w:start w:w="55" w:type="dxa"/>
+              <w:bottom w:w="78" w:type="dxa"/>
+              <w:end w:w="55" w:type="dxa"/>
             </w:tcMar>
           </w:tcPr>
           <w:p>
             <w:pPr>
-              <w:spacing w:before="0" w:after="0" w:line="216" w:lineRule="auto"/>
+              <w:spacing w:before="0" w:after="0" w:line="235" w:lineRule="auto"/>
               <w:jc w:val="left"/>
             </w:pPr>
-            <w:r/>
+            <w:r>
+              <w:rPr>
+                <w:sz w:val="15"/>
+              </w:rPr>
+            </w:r>
             <w:r>
               <w:rPr>
                 <w:rFonts w:ascii="Noto Sans CJK SC" w:hAnsi="Noto Sans CJK SC" w:eastAsia="Noto Sans CJK SC"/>
                 <w:b w:val="0"/>
                 <w:color w:val="1F2933"/>
-                <w:sz w:val="12"/>
+                <w:sz w:val="15"/>
               </w:rPr>
               <w:t>基线边界无法落定</w:t>
             </w:r>
@@ -393,24 +439,28 @@
             <w:shd w:fill="F4F7FA"/>
             <w:vAlign w:val="center"/>
             <w:tcMar>
-              <w:top w:w="35" w:type="dxa"/>
-              <w:start w:w="45" w:type="dxa"/>
-              <w:bottom w:w="35" w:type="dxa"/>
-              <w:end w:w="45" w:type="dxa"/>
+              <w:top w:w="78" w:type="dxa"/>
+              <w:start w:w="55" w:type="dxa"/>
+              <w:bottom w:w="78" w:type="dxa"/>
+              <w:end w:w="55" w:type="dxa"/>
             </w:tcMar>
           </w:tcPr>
           <w:p>
             <w:pPr>
-              <w:spacing w:before="0" w:after="0" w:line="216" w:lineRule="auto"/>
+              <w:spacing w:before="0" w:after="0" w:line="235" w:lineRule="auto"/>
               <w:jc w:val="left"/>
             </w:pPr>
-            <w:r/>
+            <w:r>
+              <w:rPr>
+                <w:sz w:val="15"/>
+              </w:rPr>
+            </w:r>
             <w:r>
               <w:rPr>
                 <w:rFonts w:ascii="Noto Sans CJK SC" w:hAnsi="Noto Sans CJK SC" w:eastAsia="Noto Sans CJK SC"/>
                 <w:b/>
                 <w:color w:val="1F2933"/>
-                <w:sz w:val="12"/>
+                <w:sz w:val="15"/>
               </w:rPr>
               <w:t>A2 近12–36月分项用电</w:t>
             </w:r>
@@ -422,24 +472,28 @@
             <w:shd w:fill="F4F7FA"/>
             <w:vAlign w:val="center"/>
             <w:tcMar>
-              <w:top w:w="35" w:type="dxa"/>
-              <w:start w:w="45" w:type="dxa"/>
-              <w:bottom w:w="35" w:type="dxa"/>
-              <w:end w:w="45" w:type="dxa"/>
+              <w:top w:w="78" w:type="dxa"/>
+              <w:start w:w="55" w:type="dxa"/>
+              <w:bottom w:w="78" w:type="dxa"/>
+              <w:end w:w="55" w:type="dxa"/>
             </w:tcMar>
           </w:tcPr>
           <w:p>
             <w:pPr>
-              <w:spacing w:before="0" w:after="0" w:line="216" w:lineRule="auto"/>
+              <w:spacing w:before="0" w:after="0" w:line="235" w:lineRule="auto"/>
               <w:jc w:val="left"/>
             </w:pPr>
-            <w:r/>
+            <w:r>
+              <w:rPr>
+                <w:sz w:val="15"/>
+              </w:rPr>
+            </w:r>
             <w:r>
               <w:rPr>
                 <w:rFonts w:ascii="Noto Sans CJK SC" w:hAnsi="Noto Sans CJK SC" w:eastAsia="Noto Sans CJK SC"/>
                 <w:b w:val="0"/>
                 <w:color w:val="1F2933"/>
-                <w:sz w:val="12"/>
+                <w:sz w:val="15"/>
               </w:rPr>
               <w:t>总表及机库、暖通、照明、工艺、充电等月度电量</w:t>
             </w:r>
@@ -451,24 +505,28 @@
             <w:shd w:fill="F4F7FA"/>
             <w:vAlign w:val="center"/>
             <w:tcMar>
-              <w:top w:w="35" w:type="dxa"/>
-              <w:start w:w="45" w:type="dxa"/>
-              <w:bottom w:w="35" w:type="dxa"/>
-              <w:end w:w="45" w:type="dxa"/>
+              <w:top w:w="78" w:type="dxa"/>
+              <w:start w:w="55" w:type="dxa"/>
+              <w:bottom w:w="78" w:type="dxa"/>
+              <w:end w:w="55" w:type="dxa"/>
             </w:tcMar>
           </w:tcPr>
           <w:p>
             <w:pPr>
-              <w:spacing w:before="0" w:after="0" w:line="216" w:lineRule="auto"/>
+              <w:spacing w:before="0" w:after="0" w:line="235" w:lineRule="auto"/>
               <w:jc w:val="left"/>
             </w:pPr>
-            <w:r/>
+            <w:r>
+              <w:rPr>
+                <w:sz w:val="15"/>
+              </w:rPr>
+            </w:r>
             <w:r>
               <w:rPr>
                 <w:rFonts w:ascii="Noto Sans CJK SC" w:hAnsi="Noto Sans CJK SC" w:eastAsia="Noto Sans CJK SC"/>
                 <w:b w:val="0"/>
                 <w:color w:val="1F2933"/>
-                <w:sz w:val="12"/>
+                <w:sz w:val="15"/>
               </w:rPr>
               <w:t>建基线、拆负荷</w:t>
             </w:r>
@@ -480,24 +538,28 @@
             <w:shd w:fill="F4F7FA"/>
             <w:vAlign w:val="center"/>
             <w:tcMar>
-              <w:top w:w="35" w:type="dxa"/>
-              <w:start w:w="45" w:type="dxa"/>
-              <w:bottom w:w="35" w:type="dxa"/>
-              <w:end w:w="45" w:type="dxa"/>
+              <w:top w:w="78" w:type="dxa"/>
+              <w:start w:w="55" w:type="dxa"/>
+              <w:bottom w:w="78" w:type="dxa"/>
+              <w:end w:w="55" w:type="dxa"/>
             </w:tcMar>
           </w:tcPr>
           <w:p>
             <w:pPr>
-              <w:spacing w:before="0" w:after="0" w:line="216" w:lineRule="auto"/>
+              <w:spacing w:before="0" w:after="0" w:line="235" w:lineRule="auto"/>
               <w:jc w:val="left"/>
             </w:pPr>
-            <w:r/>
+            <w:r>
+              <w:rPr>
+                <w:sz w:val="15"/>
+              </w:rPr>
+            </w:r>
             <w:r>
               <w:rPr>
                 <w:rFonts w:ascii="Noto Sans CJK SC" w:hAnsi="Noto Sans CJK SC" w:eastAsia="Noto Sans CJK SC"/>
                 <w:b w:val="0"/>
                 <w:color w:val="1F2933"/>
-                <w:sz w:val="12"/>
+                <w:sz w:val="15"/>
               </w:rPr>
               <w:t>Excel原始台账（含单位、时间、表计）</w:t>
             </w:r>
@@ -509,24 +571,28 @@
             <w:shd w:fill="F4F7FA"/>
             <w:vAlign w:val="center"/>
             <w:tcMar>
-              <w:top w:w="35" w:type="dxa"/>
-              <w:start w:w="45" w:type="dxa"/>
-              <w:bottom w:w="35" w:type="dxa"/>
-              <w:end w:w="45" w:type="dxa"/>
+              <w:top w:w="78" w:type="dxa"/>
+              <w:start w:w="55" w:type="dxa"/>
+              <w:bottom w:w="78" w:type="dxa"/>
+              <w:end w:w="55" w:type="dxa"/>
             </w:tcMar>
           </w:tcPr>
           <w:p>
             <w:pPr>
-              <w:spacing w:before="0" w:after="0" w:line="216" w:lineRule="auto"/>
+              <w:spacing w:before="0" w:after="0" w:line="235" w:lineRule="auto"/>
               <w:jc w:val="left"/>
             </w:pPr>
-            <w:r/>
+            <w:r>
+              <w:rPr>
+                <w:sz w:val="15"/>
+              </w:rPr>
+            </w:r>
             <w:r>
               <w:rPr>
                 <w:rFonts w:ascii="Noto Sans CJK SC" w:hAnsi="Noto Sans CJK SC" w:eastAsia="Noto Sans CJK SC"/>
                 <w:b w:val="0"/>
                 <w:color w:val="1F2933"/>
-                <w:sz w:val="12"/>
+                <w:sz w:val="15"/>
               </w:rPr>
               <w:t>无法识别重点并比选路径</w:t>
             </w:r>
@@ -542,24 +608,28 @@
             <w:tcW w:type="dxa" w:w="1644"/>
             <w:vAlign w:val="center"/>
             <w:tcMar>
-              <w:top w:w="35" w:type="dxa"/>
-              <w:start w:w="45" w:type="dxa"/>
-              <w:bottom w:w="35" w:type="dxa"/>
-              <w:end w:w="45" w:type="dxa"/>
+              <w:top w:w="78" w:type="dxa"/>
+              <w:start w:w="55" w:type="dxa"/>
+              <w:bottom w:w="78" w:type="dxa"/>
+              <w:end w:w="55" w:type="dxa"/>
             </w:tcMar>
           </w:tcPr>
           <w:p>
             <w:pPr>
-              <w:spacing w:before="0" w:after="0" w:line="216" w:lineRule="auto"/>
+              <w:spacing w:before="0" w:after="0" w:line="235" w:lineRule="auto"/>
               <w:jc w:val="left"/>
             </w:pPr>
-            <w:r/>
+            <w:r>
+              <w:rPr>
+                <w:sz w:val="15"/>
+              </w:rPr>
+            </w:r>
             <w:r>
               <w:rPr>
                 <w:rFonts w:ascii="Noto Sans CJK SC" w:hAnsi="Noto Sans CJK SC" w:eastAsia="Noto Sans CJK SC"/>
                 <w:b/>
                 <w:color w:val="1F2933"/>
-                <w:sz w:val="12"/>
+                <w:sz w:val="15"/>
               </w:rPr>
               <w:t>A3 到户电价与容量费</w:t>
             </w:r>
@@ -570,24 +640,28 @@
             <w:tcW w:type="dxa" w:w="3146"/>
             <w:vAlign w:val="center"/>
             <w:tcMar>
-              <w:top w:w="35" w:type="dxa"/>
-              <w:start w:w="45" w:type="dxa"/>
-              <w:bottom w:w="35" w:type="dxa"/>
-              <w:end w:w="45" w:type="dxa"/>
+              <w:top w:w="78" w:type="dxa"/>
+              <w:start w:w="55" w:type="dxa"/>
+              <w:bottom w:w="78" w:type="dxa"/>
+              <w:end w:w="55" w:type="dxa"/>
             </w:tcMar>
           </w:tcPr>
           <w:p>
             <w:pPr>
-              <w:spacing w:before="0" w:after="0" w:line="216" w:lineRule="auto"/>
+              <w:spacing w:before="0" w:after="0" w:line="235" w:lineRule="auto"/>
               <w:jc w:val="left"/>
             </w:pPr>
-            <w:r/>
+            <w:r>
+              <w:rPr>
+                <w:sz w:val="15"/>
+              </w:rPr>
+            </w:r>
             <w:r>
               <w:rPr>
                 <w:rFonts w:ascii="Noto Sans CJK SC" w:hAnsi="Noto Sans CJK SC" w:eastAsia="Noto Sans CJK SC"/>
                 <w:b w:val="0"/>
                 <w:color w:val="1F2933"/>
-                <w:sz w:val="12"/>
+                <w:sz w:val="15"/>
               </w:rPr>
               <w:t>峰谷电价、基本电费、合同容量/需量及结算规则</w:t>
             </w:r>
@@ -598,24 +672,28 @@
             <w:tcW w:type="dxa" w:w="1843"/>
             <w:vAlign w:val="center"/>
             <w:tcMar>
-              <w:top w:w="35" w:type="dxa"/>
-              <w:start w:w="45" w:type="dxa"/>
-              <w:bottom w:w="35" w:type="dxa"/>
-              <w:end w:w="45" w:type="dxa"/>
+              <w:top w:w="78" w:type="dxa"/>
+              <w:start w:w="55" w:type="dxa"/>
+              <w:bottom w:w="78" w:type="dxa"/>
+              <w:end w:w="55" w:type="dxa"/>
             </w:tcMar>
           </w:tcPr>
           <w:p>
             <w:pPr>
-              <w:spacing w:before="0" w:after="0" w:line="216" w:lineRule="auto"/>
+              <w:spacing w:before="0" w:after="0" w:line="235" w:lineRule="auto"/>
               <w:jc w:val="left"/>
             </w:pPr>
-            <w:r/>
+            <w:r>
+              <w:rPr>
+                <w:sz w:val="15"/>
+              </w:rPr>
+            </w:r>
             <w:r>
               <w:rPr>
                 <w:rFonts w:ascii="Noto Sans CJK SC" w:hAnsi="Noto Sans CJK SC" w:eastAsia="Noto Sans CJK SC"/>
                 <w:b w:val="0"/>
                 <w:color w:val="1F2933"/>
-                <w:sz w:val="12"/>
+                <w:sz w:val="15"/>
               </w:rPr>
               <w:t>测算用能成本</w:t>
             </w:r>
@@ -626,24 +704,28 @@
             <w:tcW w:type="dxa" w:w="2353"/>
             <w:vAlign w:val="center"/>
             <w:tcMar>
-              <w:top w:w="35" w:type="dxa"/>
-              <w:start w:w="45" w:type="dxa"/>
-              <w:bottom w:w="35" w:type="dxa"/>
-              <w:end w:w="45" w:type="dxa"/>
+              <w:top w:w="78" w:type="dxa"/>
+              <w:start w:w="55" w:type="dxa"/>
+              <w:bottom w:w="78" w:type="dxa"/>
+              <w:end w:w="55" w:type="dxa"/>
             </w:tcMar>
           </w:tcPr>
           <w:p>
             <w:pPr>
-              <w:spacing w:before="0" w:after="0" w:line="216" w:lineRule="auto"/>
+              <w:spacing w:before="0" w:after="0" w:line="235" w:lineRule="auto"/>
               <w:jc w:val="left"/>
             </w:pPr>
-            <w:r/>
+            <w:r>
+              <w:rPr>
+                <w:sz w:val="15"/>
+              </w:rPr>
+            </w:r>
             <w:r>
               <w:rPr>
                 <w:rFonts w:ascii="Noto Sans CJK SC" w:hAnsi="Noto Sans CJK SC" w:eastAsia="Noto Sans CJK SC"/>
                 <w:b w:val="0"/>
                 <w:color w:val="1F2933"/>
-                <w:sz w:val="12"/>
+                <w:sz w:val="15"/>
               </w:rPr>
               <w:t>电费单/合同或结算规则PDF</w:t>
             </w:r>
@@ -654,24 +736,28 @@
             <w:tcW w:type="dxa" w:w="1843"/>
             <w:vAlign w:val="center"/>
             <w:tcMar>
-              <w:top w:w="35" w:type="dxa"/>
-              <w:start w:w="45" w:type="dxa"/>
-              <w:bottom w:w="35" w:type="dxa"/>
-              <w:end w:w="45" w:type="dxa"/>
+              <w:top w:w="78" w:type="dxa"/>
+              <w:start w:w="55" w:type="dxa"/>
+              <w:bottom w:w="78" w:type="dxa"/>
+              <w:end w:w="55" w:type="dxa"/>
             </w:tcMar>
           </w:tcPr>
           <w:p>
             <w:pPr>
-              <w:spacing w:before="0" w:after="0" w:line="216" w:lineRule="auto"/>
+              <w:spacing w:before="0" w:after="0" w:line="235" w:lineRule="auto"/>
               <w:jc w:val="left"/>
             </w:pPr>
-            <w:r/>
+            <w:r>
+              <w:rPr>
+                <w:sz w:val="15"/>
+              </w:rPr>
+            </w:r>
             <w:r>
               <w:rPr>
                 <w:rFonts w:ascii="Noto Sans CJK SC" w:hAnsi="Noto Sans CJK SC" w:eastAsia="Noto Sans CJK SC"/>
                 <w:b w:val="0"/>
                 <w:color w:val="1F2933"/>
-                <w:sz w:val="12"/>
+                <w:sz w:val="15"/>
               </w:rPr>
               <w:t>经济性无法比较</w:t>
             </w:r>
@@ -688,24 +774,28 @@
             <w:shd w:fill="F4F7FA"/>
             <w:vAlign w:val="center"/>
             <w:tcMar>
-              <w:top w:w="35" w:type="dxa"/>
-              <w:start w:w="45" w:type="dxa"/>
-              <w:bottom w:w="35" w:type="dxa"/>
-              <w:end w:w="45" w:type="dxa"/>
+              <w:top w:w="78" w:type="dxa"/>
+              <w:start w:w="55" w:type="dxa"/>
+              <w:bottom w:w="78" w:type="dxa"/>
+              <w:end w:w="55" w:type="dxa"/>
             </w:tcMar>
           </w:tcPr>
           <w:p>
             <w:pPr>
-              <w:spacing w:before="0" w:after="0" w:line="216" w:lineRule="auto"/>
+              <w:spacing w:before="0" w:after="0" w:line="235" w:lineRule="auto"/>
               <w:jc w:val="left"/>
             </w:pPr>
-            <w:r/>
+            <w:r>
+              <w:rPr>
+                <w:sz w:val="15"/>
+              </w:rPr>
+            </w:r>
             <w:r>
               <w:rPr>
                 <w:rFonts w:ascii="Noto Sans CJK SC" w:hAnsi="Noto Sans CJK SC" w:eastAsia="Noto Sans CJK SC"/>
                 <w:b/>
                 <w:color w:val="1F2933"/>
-                <w:sz w:val="12"/>
+                <w:sz w:val="15"/>
               </w:rPr>
               <w:t>A4 光伏台账与实发</w:t>
             </w:r>
@@ -717,24 +807,28 @@
             <w:shd w:fill="F4F7FA"/>
             <w:vAlign w:val="center"/>
             <w:tcMar>
-              <w:top w:w="35" w:type="dxa"/>
-              <w:start w:w="45" w:type="dxa"/>
-              <w:bottom w:w="35" w:type="dxa"/>
-              <w:end w:w="45" w:type="dxa"/>
+              <w:top w:w="78" w:type="dxa"/>
+              <w:start w:w="55" w:type="dxa"/>
+              <w:bottom w:w="78" w:type="dxa"/>
+              <w:end w:w="55" w:type="dxa"/>
             </w:tcMar>
           </w:tcPr>
           <w:p>
             <w:pPr>
-              <w:spacing w:before="0" w:after="0" w:line="216" w:lineRule="auto"/>
+              <w:spacing w:before="0" w:after="0" w:line="235" w:lineRule="auto"/>
               <w:jc w:val="left"/>
             </w:pPr>
-            <w:r/>
+            <w:r>
+              <w:rPr>
+                <w:sz w:val="15"/>
+              </w:rPr>
+            </w:r>
             <w:r>
               <w:rPr>
                 <w:rFonts w:ascii="Noto Sans CJK SC" w:hAnsi="Noto Sans CJK SC" w:eastAsia="Noto Sans CJK SC"/>
                 <w:b w:val="0"/>
                 <w:color w:val="1F2933"/>
-                <w:sz w:val="12"/>
+                <w:sz w:val="15"/>
               </w:rPr>
               <w:t>归属、装机、投运时间；月度发电、自用、上网、弃光及表计</w:t>
             </w:r>
@@ -746,24 +840,28 @@
             <w:shd w:fill="F4F7FA"/>
             <w:vAlign w:val="center"/>
             <w:tcMar>
-              <w:top w:w="35" w:type="dxa"/>
-              <w:start w:w="45" w:type="dxa"/>
-              <w:bottom w:w="35" w:type="dxa"/>
-              <w:end w:w="45" w:type="dxa"/>
+              <w:top w:w="78" w:type="dxa"/>
+              <w:start w:w="55" w:type="dxa"/>
+              <w:bottom w:w="78" w:type="dxa"/>
+              <w:end w:w="55" w:type="dxa"/>
             </w:tcMar>
           </w:tcPr>
           <w:p>
             <w:pPr>
-              <w:spacing w:before="0" w:after="0" w:line="216" w:lineRule="auto"/>
+              <w:spacing w:before="0" w:after="0" w:line="235" w:lineRule="auto"/>
               <w:jc w:val="left"/>
             </w:pPr>
-            <w:r/>
+            <w:r>
+              <w:rPr>
+                <w:sz w:val="15"/>
+              </w:rPr>
+            </w:r>
             <w:r>
               <w:rPr>
                 <w:rFonts w:ascii="Noto Sans CJK SC" w:hAnsi="Noto Sans CJK SC" w:eastAsia="Noto Sans CJK SC"/>
                 <w:b w:val="0"/>
                 <w:color w:val="1F2933"/>
-                <w:sz w:val="12"/>
+                <w:sz w:val="15"/>
               </w:rPr>
               <w:t>核实低碳供能实绩</w:t>
             </w:r>
@@ -775,24 +873,28 @@
             <w:shd w:fill="F4F7FA"/>
             <w:vAlign w:val="center"/>
             <w:tcMar>
-              <w:top w:w="35" w:type="dxa"/>
-              <w:start w:w="45" w:type="dxa"/>
-              <w:bottom w:w="35" w:type="dxa"/>
-              <w:end w:w="45" w:type="dxa"/>
+              <w:top w:w="78" w:type="dxa"/>
+              <w:start w:w="55" w:type="dxa"/>
+              <w:bottom w:w="78" w:type="dxa"/>
+              <w:end w:w="55" w:type="dxa"/>
             </w:tcMar>
           </w:tcPr>
           <w:p>
             <w:pPr>
-              <w:spacing w:before="0" w:after="0" w:line="216" w:lineRule="auto"/>
+              <w:spacing w:before="0" w:after="0" w:line="235" w:lineRule="auto"/>
               <w:jc w:val="left"/>
             </w:pPr>
-            <w:r/>
+            <w:r>
+              <w:rPr>
+                <w:sz w:val="15"/>
+              </w:rPr>
+            </w:r>
             <w:r>
               <w:rPr>
                 <w:rFonts w:ascii="Noto Sans CJK SC" w:hAnsi="Noto Sans CJK SC" w:eastAsia="Noto Sans CJK SC"/>
                 <w:b w:val="0"/>
                 <w:color w:val="1F2933"/>
-                <w:sz w:val="12"/>
+                <w:sz w:val="15"/>
               </w:rPr>
               <w:t>Excel台账＋结算单/监控导出</w:t>
             </w:r>
@@ -804,24 +906,28 @@
             <w:shd w:fill="F4F7FA"/>
             <w:vAlign w:val="center"/>
             <w:tcMar>
-              <w:top w:w="35" w:type="dxa"/>
-              <w:start w:w="45" w:type="dxa"/>
-              <w:bottom w:w="35" w:type="dxa"/>
-              <w:end w:w="45" w:type="dxa"/>
+              <w:top w:w="78" w:type="dxa"/>
+              <w:start w:w="55" w:type="dxa"/>
+              <w:bottom w:w="78" w:type="dxa"/>
+              <w:end w:w="55" w:type="dxa"/>
             </w:tcMar>
           </w:tcPr>
           <w:p>
             <w:pPr>
-              <w:spacing w:before="0" w:after="0" w:line="216" w:lineRule="auto"/>
+              <w:spacing w:before="0" w:after="0" w:line="235" w:lineRule="auto"/>
               <w:jc w:val="left"/>
             </w:pPr>
-            <w:r/>
+            <w:r>
+              <w:rPr>
+                <w:sz w:val="15"/>
+              </w:rPr>
+            </w:r>
             <w:r>
               <w:rPr>
                 <w:rFonts w:ascii="Noto Sans CJK SC" w:hAnsi="Noto Sans CJK SC" w:eastAsia="Noto Sans CJK SC"/>
                 <w:b w:val="0"/>
                 <w:color w:val="1F2933"/>
-                <w:sz w:val="12"/>
+                <w:sz w:val="15"/>
               </w:rPr>
               <w:t>光伏贡献无法核定</w:t>
             </w:r>
@@ -837,24 +943,28 @@
             <w:tcW w:type="dxa" w:w="1644"/>
             <w:vAlign w:val="center"/>
             <w:tcMar>
-              <w:top w:w="35" w:type="dxa"/>
-              <w:start w:w="45" w:type="dxa"/>
-              <w:bottom w:w="35" w:type="dxa"/>
-              <w:end w:w="45" w:type="dxa"/>
+              <w:top w:w="78" w:type="dxa"/>
+              <w:start w:w="55" w:type="dxa"/>
+              <w:bottom w:w="78" w:type="dxa"/>
+              <w:end w:w="55" w:type="dxa"/>
             </w:tcMar>
           </w:tcPr>
           <w:p>
             <w:pPr>
-              <w:spacing w:before="0" w:after="0" w:line="216" w:lineRule="auto"/>
+              <w:spacing w:before="0" w:after="0" w:line="235" w:lineRule="auto"/>
               <w:jc w:val="left"/>
             </w:pPr>
-            <w:r/>
+            <w:r>
+              <w:rPr>
+                <w:sz w:val="15"/>
+              </w:rPr>
+            </w:r>
             <w:r>
               <w:rPr>
                 <w:rFonts w:ascii="Noto Sans CJK SC" w:hAnsi="Noto Sans CJK SC" w:eastAsia="Noto Sans CJK SC"/>
                 <w:b/>
                 <w:color w:val="1F2933"/>
-                <w:sz w:val="12"/>
+                <w:sz w:val="15"/>
               </w:rPr>
               <w:t>A5 机库暖通与照明</w:t>
             </w:r>
@@ -865,24 +975,28 @@
             <w:tcW w:type="dxa" w:w="3146"/>
             <w:vAlign w:val="center"/>
             <w:tcMar>
-              <w:top w:w="35" w:type="dxa"/>
-              <w:start w:w="45" w:type="dxa"/>
-              <w:bottom w:w="35" w:type="dxa"/>
-              <w:end w:w="45" w:type="dxa"/>
+              <w:top w:w="78" w:type="dxa"/>
+              <w:start w:w="55" w:type="dxa"/>
+              <w:bottom w:w="78" w:type="dxa"/>
+              <w:end w:w="55" w:type="dxa"/>
             </w:tcMar>
           </w:tcPr>
           <w:p>
             <w:pPr>
-              <w:spacing w:before="0" w:after="0" w:line="216" w:lineRule="auto"/>
+              <w:spacing w:before="0" w:after="0" w:line="235" w:lineRule="auto"/>
               <w:jc w:val="left"/>
             </w:pPr>
-            <w:r/>
+            <w:r>
+              <w:rPr>
+                <w:sz w:val="15"/>
+              </w:rPr>
+            </w:r>
             <w:r>
               <w:rPr>
                 <w:rFonts w:ascii="Noto Sans CJK SC" w:hAnsi="Noto Sans CJK SC" w:eastAsia="Noto Sans CJK SC"/>
                 <w:b w:val="0"/>
                 <w:color w:val="1F2933"/>
-                <w:sz w:val="12"/>
+                <w:sz w:val="15"/>
               </w:rPr>
               <w:t>设备清单、功率、运行时段、控制策略及能耗</w:t>
             </w:r>
@@ -893,24 +1007,28 @@
             <w:tcW w:type="dxa" w:w="1843"/>
             <w:vAlign w:val="center"/>
             <w:tcMar>
-              <w:top w:w="35" w:type="dxa"/>
-              <w:start w:w="45" w:type="dxa"/>
-              <w:bottom w:w="35" w:type="dxa"/>
-              <w:end w:w="45" w:type="dxa"/>
+              <w:top w:w="78" w:type="dxa"/>
+              <w:start w:w="55" w:type="dxa"/>
+              <w:bottom w:w="78" w:type="dxa"/>
+              <w:end w:w="55" w:type="dxa"/>
             </w:tcMar>
           </w:tcPr>
           <w:p>
             <w:pPr>
-              <w:spacing w:before="0" w:after="0" w:line="216" w:lineRule="auto"/>
+              <w:spacing w:before="0" w:after="0" w:line="235" w:lineRule="auto"/>
               <w:jc w:val="left"/>
             </w:pPr>
-            <w:r/>
+            <w:r>
+              <w:rPr>
+                <w:sz w:val="15"/>
+              </w:rPr>
+            </w:r>
             <w:r>
               <w:rPr>
                 <w:rFonts w:ascii="Noto Sans CJK SC" w:hAnsi="Noto Sans CJK SC" w:eastAsia="Noto Sans CJK SC"/>
                 <w:b w:val="0"/>
                 <w:color w:val="1F2933"/>
-                <w:sz w:val="12"/>
+                <w:sz w:val="15"/>
               </w:rPr>
               <w:t>判断节能改造空间</w:t>
             </w:r>
@@ -921,24 +1039,28 @@
             <w:tcW w:type="dxa" w:w="2353"/>
             <w:vAlign w:val="center"/>
             <w:tcMar>
-              <w:top w:w="35" w:type="dxa"/>
-              <w:start w:w="45" w:type="dxa"/>
-              <w:bottom w:w="35" w:type="dxa"/>
-              <w:end w:w="45" w:type="dxa"/>
+              <w:top w:w="78" w:type="dxa"/>
+              <w:start w:w="55" w:type="dxa"/>
+              <w:bottom w:w="78" w:type="dxa"/>
+              <w:end w:w="55" w:type="dxa"/>
             </w:tcMar>
           </w:tcPr>
           <w:p>
             <w:pPr>
-              <w:spacing w:before="0" w:after="0" w:line="216" w:lineRule="auto"/>
+              <w:spacing w:before="0" w:after="0" w:line="235" w:lineRule="auto"/>
               <w:jc w:val="left"/>
             </w:pPr>
-            <w:r/>
+            <w:r>
+              <w:rPr>
+                <w:sz w:val="15"/>
+              </w:rPr>
+            </w:r>
             <w:r>
               <w:rPr>
                 <w:rFonts w:ascii="Noto Sans CJK SC" w:hAnsi="Noto Sans CJK SC" w:eastAsia="Noto Sans CJK SC"/>
                 <w:b w:val="0"/>
                 <w:color w:val="1F2933"/>
-                <w:sz w:val="12"/>
+                <w:sz w:val="15"/>
               </w:rPr>
               <w:t>设备表Excel＋图纸/BMS截图</w:t>
             </w:r>
@@ -949,24 +1071,28 @@
             <w:tcW w:type="dxa" w:w="1843"/>
             <w:vAlign w:val="center"/>
             <w:tcMar>
-              <w:top w:w="35" w:type="dxa"/>
-              <w:start w:w="45" w:type="dxa"/>
-              <w:bottom w:w="35" w:type="dxa"/>
-              <w:end w:w="45" w:type="dxa"/>
+              <w:top w:w="78" w:type="dxa"/>
+              <w:start w:w="55" w:type="dxa"/>
+              <w:bottom w:w="78" w:type="dxa"/>
+              <w:end w:w="55" w:type="dxa"/>
             </w:tcMar>
           </w:tcPr>
           <w:p>
             <w:pPr>
-              <w:spacing w:before="0" w:after="0" w:line="216" w:lineRule="auto"/>
+              <w:spacing w:before="0" w:after="0" w:line="235" w:lineRule="auto"/>
               <w:jc w:val="left"/>
             </w:pPr>
-            <w:r/>
+            <w:r>
+              <w:rPr>
+                <w:sz w:val="15"/>
+              </w:rPr>
+            </w:r>
             <w:r>
               <w:rPr>
                 <w:rFonts w:ascii="Noto Sans CJK SC" w:hAnsi="Noto Sans CJK SC" w:eastAsia="Noto Sans CJK SC"/>
                 <w:b w:val="0"/>
                 <w:color w:val="1F2933"/>
-                <w:sz w:val="12"/>
+                <w:sz w:val="15"/>
               </w:rPr>
               <w:t>措施负荷无法核实</w:t>
             </w:r>
@@ -983,24 +1109,28 @@
             <w:shd w:fill="F4F7FA"/>
             <w:vAlign w:val="center"/>
             <w:tcMar>
-              <w:top w:w="35" w:type="dxa"/>
-              <w:start w:w="45" w:type="dxa"/>
-              <w:bottom w:w="35" w:type="dxa"/>
-              <w:end w:w="45" w:type="dxa"/>
+              <w:top w:w="78" w:type="dxa"/>
+              <w:start w:w="55" w:type="dxa"/>
+              <w:bottom w:w="78" w:type="dxa"/>
+              <w:end w:w="55" w:type="dxa"/>
             </w:tcMar>
           </w:tcPr>
           <w:p>
             <w:pPr>
-              <w:spacing w:before="0" w:after="0" w:line="216" w:lineRule="auto"/>
+              <w:spacing w:before="0" w:after="0" w:line="235" w:lineRule="auto"/>
               <w:jc w:val="left"/>
             </w:pPr>
-            <w:r/>
+            <w:r>
+              <w:rPr>
+                <w:sz w:val="15"/>
+              </w:rPr>
+            </w:r>
             <w:r>
               <w:rPr>
                 <w:rFonts w:ascii="Noto Sans CJK SC" w:hAnsi="Noto Sans CJK SC" w:eastAsia="Noto Sans CJK SC"/>
                 <w:b/>
                 <w:color w:val="1F2933"/>
-                <w:sz w:val="12"/>
+                <w:sz w:val="15"/>
               </w:rPr>
               <w:t>A6 建筑与屋面条件</w:t>
             </w:r>
@@ -1012,24 +1142,28 @@
             <w:shd w:fill="F4F7FA"/>
             <w:vAlign w:val="center"/>
             <w:tcMar>
-              <w:top w:w="35" w:type="dxa"/>
-              <w:start w:w="45" w:type="dxa"/>
-              <w:bottom w:w="35" w:type="dxa"/>
-              <w:end w:w="45" w:type="dxa"/>
+              <w:top w:w="78" w:type="dxa"/>
+              <w:start w:w="55" w:type="dxa"/>
+              <w:bottom w:w="78" w:type="dxa"/>
+              <w:end w:w="55" w:type="dxa"/>
             </w:tcMar>
           </w:tcPr>
           <w:p>
             <w:pPr>
-              <w:spacing w:before="0" w:after="0" w:line="216" w:lineRule="auto"/>
+              <w:spacing w:before="0" w:after="0" w:line="235" w:lineRule="auto"/>
               <w:jc w:val="left"/>
             </w:pPr>
-            <w:r/>
+            <w:r>
+              <w:rPr>
+                <w:sz w:val="15"/>
+              </w:rPr>
+            </w:r>
             <w:r>
               <w:rPr>
                 <w:rFonts w:ascii="Noto Sans CJK SC" w:hAnsi="Noto Sans CJK SC" w:eastAsia="Noto Sans CJK SC"/>
                 <w:b w:val="0"/>
                 <w:color w:val="1F2933"/>
-                <w:sz w:val="12"/>
+                <w:sz w:val="15"/>
               </w:rPr>
               <w:t>单体用途/面积；屋面可用面积、荷载、遮挡、防水消防及权属</w:t>
             </w:r>
@@ -1041,24 +1175,28 @@
             <w:shd w:fill="F4F7FA"/>
             <w:vAlign w:val="center"/>
             <w:tcMar>
-              <w:top w:w="35" w:type="dxa"/>
-              <w:start w:w="45" w:type="dxa"/>
-              <w:bottom w:w="35" w:type="dxa"/>
-              <w:end w:w="45" w:type="dxa"/>
+              <w:top w:w="78" w:type="dxa"/>
+              <w:start w:w="55" w:type="dxa"/>
+              <w:bottom w:w="78" w:type="dxa"/>
+              <w:end w:w="55" w:type="dxa"/>
             </w:tcMar>
           </w:tcPr>
           <w:p>
             <w:pPr>
-              <w:spacing w:before="0" w:after="0" w:line="216" w:lineRule="auto"/>
+              <w:spacing w:before="0" w:after="0" w:line="235" w:lineRule="auto"/>
               <w:jc w:val="left"/>
             </w:pPr>
-            <w:r/>
+            <w:r>
+              <w:rPr>
+                <w:sz w:val="15"/>
+              </w:rPr>
+            </w:r>
             <w:r>
               <w:rPr>
                 <w:rFonts w:ascii="Noto Sans CJK SC" w:hAnsi="Noto Sans CJK SC" w:eastAsia="Noto Sans CJK SC"/>
                 <w:b w:val="0"/>
                 <w:color w:val="1F2933"/>
-                <w:sz w:val="12"/>
+                <w:sz w:val="15"/>
               </w:rPr>
               <w:t>判断光伏与建筑改造可实施性</w:t>
             </w:r>
@@ -1070,24 +1208,28 @@
             <w:shd w:fill="F4F7FA"/>
             <w:vAlign w:val="center"/>
             <w:tcMar>
-              <w:top w:w="35" w:type="dxa"/>
-              <w:start w:w="45" w:type="dxa"/>
-              <w:bottom w:w="35" w:type="dxa"/>
-              <w:end w:w="45" w:type="dxa"/>
+              <w:top w:w="78" w:type="dxa"/>
+              <w:start w:w="55" w:type="dxa"/>
+              <w:bottom w:w="78" w:type="dxa"/>
+              <w:end w:w="55" w:type="dxa"/>
             </w:tcMar>
           </w:tcPr>
           <w:p>
             <w:pPr>
-              <w:spacing w:before="0" w:after="0" w:line="216" w:lineRule="auto"/>
+              <w:spacing w:before="0" w:after="0" w:line="235" w:lineRule="auto"/>
               <w:jc w:val="left"/>
             </w:pPr>
-            <w:r/>
+            <w:r>
+              <w:rPr>
+                <w:sz w:val="15"/>
+              </w:rPr>
+            </w:r>
             <w:r>
               <w:rPr>
                 <w:rFonts w:ascii="Noto Sans CJK SC" w:hAnsi="Noto Sans CJK SC" w:eastAsia="Noto Sans CJK SC"/>
                 <w:b w:val="0"/>
                 <w:color w:val="1F2933"/>
-                <w:sz w:val="12"/>
+                <w:sz w:val="15"/>
               </w:rPr>
               <w:t>CAD/PDF图纸＋勘察/台账</w:t>
             </w:r>
@@ -1099,24 +1241,28 @@
             <w:shd w:fill="F4F7FA"/>
             <w:vAlign w:val="center"/>
             <w:tcMar>
-              <w:top w:w="35" w:type="dxa"/>
-              <w:start w:w="45" w:type="dxa"/>
-              <w:bottom w:w="35" w:type="dxa"/>
-              <w:end w:w="45" w:type="dxa"/>
+              <w:top w:w="78" w:type="dxa"/>
+              <w:start w:w="55" w:type="dxa"/>
+              <w:bottom w:w="78" w:type="dxa"/>
+              <w:end w:w="55" w:type="dxa"/>
             </w:tcMar>
           </w:tcPr>
           <w:p>
             <w:pPr>
-              <w:spacing w:before="0" w:after="0" w:line="216" w:lineRule="auto"/>
+              <w:spacing w:before="0" w:after="0" w:line="235" w:lineRule="auto"/>
               <w:jc w:val="left"/>
             </w:pPr>
-            <w:r/>
+            <w:r>
+              <w:rPr>
+                <w:sz w:val="15"/>
+              </w:rPr>
+            </w:r>
             <w:r>
               <w:rPr>
                 <w:rFonts w:ascii="Noto Sans CJK SC" w:hAnsi="Noto Sans CJK SC" w:eastAsia="Noto Sans CJK SC"/>
                 <w:b w:val="0"/>
                 <w:color w:val="1F2933"/>
-                <w:sz w:val="12"/>
+                <w:sz w:val="15"/>
               </w:rPr>
               <w:t>无法判断落地条件</w:t>
             </w:r>
@@ -1132,24 +1278,28 @@
             <w:tcW w:type="dxa" w:w="1644"/>
             <w:vAlign w:val="center"/>
             <w:tcMar>
-              <w:top w:w="35" w:type="dxa"/>
-              <w:start w:w="45" w:type="dxa"/>
-              <w:bottom w:w="35" w:type="dxa"/>
-              <w:end w:w="45" w:type="dxa"/>
+              <w:top w:w="78" w:type="dxa"/>
+              <w:start w:w="55" w:type="dxa"/>
+              <w:bottom w:w="78" w:type="dxa"/>
+              <w:end w:w="55" w:type="dxa"/>
             </w:tcMar>
           </w:tcPr>
           <w:p>
             <w:pPr>
-              <w:spacing w:before="0" w:after="0" w:line="216" w:lineRule="auto"/>
+              <w:spacing w:before="0" w:after="0" w:line="235" w:lineRule="auto"/>
               <w:jc w:val="left"/>
             </w:pPr>
-            <w:r/>
+            <w:r>
+              <w:rPr>
+                <w:sz w:val="15"/>
+              </w:rPr>
+            </w:r>
             <w:r>
               <w:rPr>
                 <w:rFonts w:ascii="Noto Sans CJK SC" w:hAnsi="Noto Sans CJK SC" w:eastAsia="Noto Sans CJK SC"/>
                 <w:b/>
                 <w:color w:val="1F2933"/>
-                <w:sz w:val="12"/>
+                <w:sz w:val="15"/>
               </w:rPr>
               <w:t>A7 申报主体与独立核算证明</w:t>
             </w:r>
@@ -1160,24 +1310,28 @@
             <w:tcW w:type="dxa" w:w="3146"/>
             <w:vAlign w:val="center"/>
             <w:tcMar>
-              <w:top w:w="35" w:type="dxa"/>
-              <w:start w:w="45" w:type="dxa"/>
-              <w:bottom w:w="35" w:type="dxa"/>
-              <w:end w:w="45" w:type="dxa"/>
+              <w:top w:w="78" w:type="dxa"/>
+              <w:start w:w="55" w:type="dxa"/>
+              <w:bottom w:w="78" w:type="dxa"/>
+              <w:end w:w="55" w:type="dxa"/>
             </w:tcMar>
           </w:tcPr>
           <w:p>
             <w:pPr>
-              <w:spacing w:before="0" w:after="0" w:line="216" w:lineRule="auto"/>
+              <w:spacing w:before="0" w:after="0" w:line="235" w:lineRule="auto"/>
               <w:jc w:val="left"/>
             </w:pPr>
-            <w:r/>
+            <w:r>
+              <w:rPr>
+                <w:sz w:val="15"/>
+              </w:rPr>
+            </w:r>
             <w:r>
               <w:rPr>
                 <w:rFonts w:ascii="Noto Sans CJK SC" w:hAnsi="Noto Sans CJK SC" w:eastAsia="Noto Sans CJK SC"/>
                 <w:b w:val="0"/>
                 <w:color w:val="1F2933"/>
-                <w:sz w:val="12"/>
+                <w:sz w:val="15"/>
               </w:rPr>
               <w:t>主体全称、隶属关系；独立核算、视同法人或统计登记材料</w:t>
             </w:r>
@@ -1188,24 +1342,28 @@
             <w:tcW w:type="dxa" w:w="1843"/>
             <w:vAlign w:val="center"/>
             <w:tcMar>
-              <w:top w:w="35" w:type="dxa"/>
-              <w:start w:w="45" w:type="dxa"/>
-              <w:bottom w:w="35" w:type="dxa"/>
-              <w:end w:w="45" w:type="dxa"/>
+              <w:top w:w="78" w:type="dxa"/>
+              <w:start w:w="55" w:type="dxa"/>
+              <w:bottom w:w="78" w:type="dxa"/>
+              <w:end w:w="55" w:type="dxa"/>
             </w:tcMar>
           </w:tcPr>
           <w:p>
             <w:pPr>
-              <w:spacing w:before="0" w:after="0" w:line="216" w:lineRule="auto"/>
+              <w:spacing w:before="0" w:after="0" w:line="235" w:lineRule="auto"/>
               <w:jc w:val="left"/>
             </w:pPr>
-            <w:r/>
+            <w:r>
+              <w:rPr>
+                <w:sz w:val="15"/>
+              </w:rPr>
+            </w:r>
             <w:r>
               <w:rPr>
                 <w:rFonts w:ascii="Noto Sans CJK SC" w:hAnsi="Noto Sans CJK SC" w:eastAsia="Noto Sans CJK SC"/>
                 <w:b w:val="0"/>
                 <w:color w:val="1F2933"/>
-                <w:sz w:val="12"/>
+                <w:sz w:val="15"/>
               </w:rPr>
               <w:t>明确申报与数据归口</w:t>
             </w:r>
@@ -1216,24 +1374,28 @@
             <w:tcW w:type="dxa" w:w="2353"/>
             <w:vAlign w:val="center"/>
             <w:tcMar>
-              <w:top w:w="35" w:type="dxa"/>
-              <w:start w:w="45" w:type="dxa"/>
-              <w:bottom w:w="35" w:type="dxa"/>
-              <w:end w:w="45" w:type="dxa"/>
+              <w:top w:w="78" w:type="dxa"/>
+              <w:start w:w="55" w:type="dxa"/>
+              <w:bottom w:w="78" w:type="dxa"/>
+              <w:end w:w="55" w:type="dxa"/>
             </w:tcMar>
           </w:tcPr>
           <w:p>
             <w:pPr>
-              <w:spacing w:before="0" w:after="0" w:line="216" w:lineRule="auto"/>
+              <w:spacing w:before="0" w:after="0" w:line="235" w:lineRule="auto"/>
               <w:jc w:val="left"/>
             </w:pPr>
-            <w:r/>
+            <w:r>
+              <w:rPr>
+                <w:sz w:val="15"/>
+              </w:rPr>
+            </w:r>
             <w:r>
               <w:rPr>
                 <w:rFonts w:ascii="Noto Sans CJK SC" w:hAnsi="Noto Sans CJK SC" w:eastAsia="Noto Sans CJK SC"/>
                 <w:b w:val="0"/>
                 <w:color w:val="1F2933"/>
-                <w:sz w:val="12"/>
+                <w:sz w:val="15"/>
               </w:rPr>
               <w:t>证照/登记/说明PDF</w:t>
             </w:r>
@@ -1244,24 +1406,28 @@
             <w:tcW w:type="dxa" w:w="1843"/>
             <w:vAlign w:val="center"/>
             <w:tcMar>
-              <w:top w:w="35" w:type="dxa"/>
-              <w:start w:w="45" w:type="dxa"/>
-              <w:bottom w:w="35" w:type="dxa"/>
-              <w:end w:w="45" w:type="dxa"/>
+              <w:top w:w="78" w:type="dxa"/>
+              <w:start w:w="55" w:type="dxa"/>
+              <w:bottom w:w="78" w:type="dxa"/>
+              <w:end w:w="55" w:type="dxa"/>
             </w:tcMar>
           </w:tcPr>
           <w:p>
             <w:pPr>
-              <w:spacing w:before="0" w:after="0" w:line="216" w:lineRule="auto"/>
+              <w:spacing w:before="0" w:after="0" w:line="235" w:lineRule="auto"/>
               <w:jc w:val="left"/>
             </w:pPr>
-            <w:r/>
+            <w:r>
+              <w:rPr>
+                <w:sz w:val="15"/>
+              </w:rPr>
+            </w:r>
             <w:r>
               <w:rPr>
                 <w:rFonts w:ascii="Noto Sans CJK SC" w:hAnsi="Noto Sans CJK SC" w:eastAsia="Noto Sans CJK SC"/>
                 <w:b w:val="0"/>
                 <w:color w:val="1F2933"/>
-                <w:sz w:val="12"/>
+                <w:sz w:val="15"/>
               </w:rPr>
               <w:t>主体与数据归口待定</w:t>
             </w:r>
@@ -1278,24 +1444,28 @@
             <w:shd w:fill="F4F7FA"/>
             <w:vAlign w:val="center"/>
             <w:tcMar>
-              <w:top w:w="35" w:type="dxa"/>
-              <w:start w:w="45" w:type="dxa"/>
-              <w:bottom w:w="35" w:type="dxa"/>
-              <w:end w:w="45" w:type="dxa"/>
+              <w:top w:w="78" w:type="dxa"/>
+              <w:start w:w="55" w:type="dxa"/>
+              <w:bottom w:w="78" w:type="dxa"/>
+              <w:end w:w="55" w:type="dxa"/>
             </w:tcMar>
           </w:tcPr>
           <w:p>
             <w:pPr>
-              <w:spacing w:before="0" w:after="0" w:line="216" w:lineRule="auto"/>
+              <w:spacing w:before="0" w:after="0" w:line="235" w:lineRule="auto"/>
               <w:jc w:val="left"/>
             </w:pPr>
-            <w:r/>
+            <w:r>
+              <w:rPr>
+                <w:sz w:val="15"/>
+              </w:rPr>
+            </w:r>
             <w:r>
               <w:rPr>
                 <w:rFonts w:ascii="Noto Sans CJK SC" w:hAnsi="Noto Sans CJK SC" w:eastAsia="Noto Sans CJK SC"/>
                 <w:b/>
                 <w:color w:val="1F2933"/>
-                <w:sz w:val="12"/>
+                <w:sz w:val="15"/>
               </w:rPr>
               <w:t>A8 申报边界与功能区红线</w:t>
             </w:r>
@@ -1307,24 +1477,28 @@
             <w:shd w:fill="F4F7FA"/>
             <w:vAlign w:val="center"/>
             <w:tcMar>
-              <w:top w:w="35" w:type="dxa"/>
-              <w:start w:w="45" w:type="dxa"/>
-              <w:bottom w:w="35" w:type="dxa"/>
-              <w:end w:w="45" w:type="dxa"/>
+              <w:top w:w="78" w:type="dxa"/>
+              <w:start w:w="55" w:type="dxa"/>
+              <w:bottom w:w="78" w:type="dxa"/>
+              <w:end w:w="55" w:type="dxa"/>
             </w:tcMar>
           </w:tcPr>
           <w:p>
             <w:pPr>
-              <w:spacing w:before="0" w:after="0" w:line="216" w:lineRule="auto"/>
+              <w:spacing w:before="0" w:after="0" w:line="235" w:lineRule="auto"/>
               <w:jc w:val="left"/>
             </w:pPr>
-            <w:r/>
+            <w:r>
+              <w:rPr>
+                <w:sz w:val="15"/>
+              </w:rPr>
+            </w:r>
             <w:r>
               <w:rPr>
                 <w:rFonts w:ascii="Noto Sans CJK SC" w:hAnsi="Noto Sans CJK SC" w:eastAsia="Noto Sans CJK SC"/>
                 <w:b w:val="0"/>
                 <w:color w:val="1F2933"/>
-                <w:sz w:val="12"/>
+                <w:sz w:val="15"/>
               </w:rPr>
               <w:t>机务维修区范围、功能分区、红线图及纳入/排除单体</w:t>
             </w:r>
@@ -1336,24 +1510,28 @@
             <w:shd w:fill="F4F7FA"/>
             <w:vAlign w:val="center"/>
             <w:tcMar>
-              <w:top w:w="35" w:type="dxa"/>
-              <w:start w:w="45" w:type="dxa"/>
-              <w:bottom w:w="35" w:type="dxa"/>
-              <w:end w:w="45" w:type="dxa"/>
+              <w:top w:w="78" w:type="dxa"/>
+              <w:start w:w="55" w:type="dxa"/>
+              <w:bottom w:w="78" w:type="dxa"/>
+              <w:end w:w="55" w:type="dxa"/>
             </w:tcMar>
           </w:tcPr>
           <w:p>
             <w:pPr>
-              <w:spacing w:before="0" w:after="0" w:line="216" w:lineRule="auto"/>
+              <w:spacing w:before="0" w:after="0" w:line="235" w:lineRule="auto"/>
               <w:jc w:val="left"/>
             </w:pPr>
-            <w:r/>
+            <w:r>
+              <w:rPr>
+                <w:sz w:val="15"/>
+              </w:rPr>
+            </w:r>
             <w:r>
               <w:rPr>
                 <w:rFonts w:ascii="Noto Sans CJK SC" w:hAnsi="Noto Sans CJK SC" w:eastAsia="Noto Sans CJK SC"/>
                 <w:b w:val="0"/>
                 <w:color w:val="1F2933"/>
-                <w:sz w:val="12"/>
+                <w:sz w:val="15"/>
               </w:rPr>
               <w:t>固定评价和数据边界</w:t>
             </w:r>
@@ -1365,24 +1543,28 @@
             <w:shd w:fill="F4F7FA"/>
             <w:vAlign w:val="center"/>
             <w:tcMar>
-              <w:top w:w="35" w:type="dxa"/>
-              <w:start w:w="45" w:type="dxa"/>
-              <w:bottom w:w="35" w:type="dxa"/>
-              <w:end w:w="45" w:type="dxa"/>
+              <w:top w:w="78" w:type="dxa"/>
+              <w:start w:w="55" w:type="dxa"/>
+              <w:bottom w:w="78" w:type="dxa"/>
+              <w:end w:w="55" w:type="dxa"/>
             </w:tcMar>
           </w:tcPr>
           <w:p>
             <w:pPr>
-              <w:spacing w:before="0" w:after="0" w:line="216" w:lineRule="auto"/>
+              <w:spacing w:before="0" w:after="0" w:line="235" w:lineRule="auto"/>
               <w:jc w:val="left"/>
             </w:pPr>
-            <w:r/>
+            <w:r>
+              <w:rPr>
+                <w:sz w:val="15"/>
+              </w:rPr>
+            </w:r>
             <w:r>
               <w:rPr>
                 <w:rFonts w:ascii="Noto Sans CJK SC" w:hAnsi="Noto Sans CJK SC" w:eastAsia="Noto Sans CJK SC"/>
                 <w:b w:val="0"/>
                 <w:color w:val="1F2933"/>
-                <w:sz w:val="12"/>
+                <w:sz w:val="15"/>
               </w:rPr>
               <w:t>红线图CAD/PDF＋单体清单Excel</w:t>
             </w:r>
@@ -1394,24 +1576,28 @@
             <w:shd w:fill="F4F7FA"/>
             <w:vAlign w:val="center"/>
             <w:tcMar>
-              <w:top w:w="35" w:type="dxa"/>
-              <w:start w:w="45" w:type="dxa"/>
-              <w:bottom w:w="35" w:type="dxa"/>
-              <w:end w:w="45" w:type="dxa"/>
+              <w:top w:w="78" w:type="dxa"/>
+              <w:start w:w="55" w:type="dxa"/>
+              <w:bottom w:w="78" w:type="dxa"/>
+              <w:end w:w="55" w:type="dxa"/>
             </w:tcMar>
           </w:tcPr>
           <w:p>
             <w:pPr>
-              <w:spacing w:before="0" w:after="0" w:line="216" w:lineRule="auto"/>
+              <w:spacing w:before="0" w:after="0" w:line="235" w:lineRule="auto"/>
               <w:jc w:val="left"/>
             </w:pPr>
-            <w:r/>
+            <w:r>
+              <w:rPr>
+                <w:sz w:val="15"/>
+              </w:rPr>
+            </w:r>
             <w:r>
               <w:rPr>
                 <w:rFonts w:ascii="Noto Sans CJK SC" w:hAnsi="Noto Sans CJK SC" w:eastAsia="Noto Sans CJK SC"/>
                 <w:b w:val="0"/>
                 <w:color w:val="1F2933"/>
-                <w:sz w:val="12"/>
+                <w:sz w:val="15"/>
               </w:rPr>
               <w:t>指标口径可能漂移</w:t>
             </w:r>
@@ -1427,24 +1613,28 @@
             <w:tcW w:type="dxa" w:w="1644"/>
             <w:vAlign w:val="center"/>
             <w:tcMar>
-              <w:top w:w="35" w:type="dxa"/>
-              <w:start w:w="45" w:type="dxa"/>
-              <w:bottom w:w="35" w:type="dxa"/>
-              <w:end w:w="45" w:type="dxa"/>
+              <w:top w:w="78" w:type="dxa"/>
+              <w:start w:w="55" w:type="dxa"/>
+              <w:bottom w:w="78" w:type="dxa"/>
+              <w:end w:w="55" w:type="dxa"/>
             </w:tcMar>
           </w:tcPr>
           <w:p>
             <w:pPr>
-              <w:spacing w:before="0" w:after="0" w:line="216" w:lineRule="auto"/>
+              <w:spacing w:before="0" w:after="0" w:line="235" w:lineRule="auto"/>
               <w:jc w:val="left"/>
             </w:pPr>
-            <w:r/>
+            <w:r>
+              <w:rPr>
+                <w:sz w:val="15"/>
+              </w:rPr>
+            </w:r>
             <w:r>
               <w:rPr>
                 <w:rFonts w:ascii="Noto Sans CJK SC" w:hAnsi="Noto Sans CJK SC" w:eastAsia="Noto Sans CJK SC"/>
                 <w:b/>
                 <w:color w:val="1F2933"/>
-                <w:sz w:val="12"/>
+                <w:sz w:val="15"/>
               </w:rPr>
               <w:t>A9 北京市绿色工厂申报意向</w:t>
             </w:r>
@@ -1455,24 +1645,28 @@
             <w:tcW w:type="dxa" w:w="3146"/>
             <w:vAlign w:val="center"/>
             <w:tcMar>
-              <w:top w:w="35" w:type="dxa"/>
-              <w:start w:w="45" w:type="dxa"/>
-              <w:bottom w:w="35" w:type="dxa"/>
-              <w:end w:w="45" w:type="dxa"/>
+              <w:top w:w="78" w:type="dxa"/>
+              <w:start w:w="55" w:type="dxa"/>
+              <w:bottom w:w="78" w:type="dxa"/>
+              <w:end w:w="55" w:type="dxa"/>
             </w:tcMar>
           </w:tcPr>
           <w:p>
             <w:pPr>
-              <w:spacing w:before="0" w:after="0" w:line="216" w:lineRule="auto"/>
+              <w:spacing w:before="0" w:after="0" w:line="235" w:lineRule="auto"/>
               <w:jc w:val="left"/>
             </w:pPr>
-            <w:r/>
+            <w:r>
+              <w:rPr>
+                <w:sz w:val="15"/>
+              </w:rPr>
+            </w:r>
             <w:r>
               <w:rPr>
                 <w:rFonts w:ascii="Noto Sans CJK SC" w:hAnsi="Noto Sans CJK SC" w:eastAsia="Noto Sans CJK SC"/>
                 <w:b w:val="0"/>
                 <w:color w:val="1F2933"/>
-                <w:sz w:val="12"/>
+                <w:sz w:val="15"/>
               </w:rPr>
               <w:t>是否申报、拟申报主体、计划批次及牵头部门</w:t>
             </w:r>
@@ -1483,24 +1677,28 @@
             <w:tcW w:type="dxa" w:w="1843"/>
             <w:vAlign w:val="center"/>
             <w:tcMar>
-              <w:top w:w="35" w:type="dxa"/>
-              <w:start w:w="45" w:type="dxa"/>
-              <w:bottom w:w="35" w:type="dxa"/>
-              <w:end w:w="45" w:type="dxa"/>
+              <w:top w:w="78" w:type="dxa"/>
+              <w:start w:w="55" w:type="dxa"/>
+              <w:bottom w:w="78" w:type="dxa"/>
+              <w:end w:w="55" w:type="dxa"/>
             </w:tcMar>
           </w:tcPr>
           <w:p>
             <w:pPr>
-              <w:spacing w:before="0" w:after="0" w:line="216" w:lineRule="auto"/>
+              <w:spacing w:before="0" w:after="0" w:line="235" w:lineRule="auto"/>
               <w:jc w:val="left"/>
             </w:pPr>
-            <w:r/>
+            <w:r>
+              <w:rPr>
+                <w:sz w:val="15"/>
+              </w:rPr>
+            </w:r>
             <w:r>
               <w:rPr>
                 <w:rFonts w:ascii="Noto Sans CJK SC" w:hAnsi="Noto Sans CJK SC" w:eastAsia="Noto Sans CJK SC"/>
                 <w:b w:val="0"/>
                 <w:color w:val="1F2933"/>
-                <w:sz w:val="12"/>
+                <w:sz w:val="15"/>
               </w:rPr>
               <w:t>衔接前置准备与包装安排</w:t>
             </w:r>
@@ -1511,24 +1709,28 @@
             <w:tcW w:type="dxa" w:w="2353"/>
             <w:vAlign w:val="center"/>
             <w:tcMar>
-              <w:top w:w="35" w:type="dxa"/>
-              <w:start w:w="45" w:type="dxa"/>
-              <w:bottom w:w="35" w:type="dxa"/>
-              <w:end w:w="45" w:type="dxa"/>
+              <w:top w:w="78" w:type="dxa"/>
+              <w:start w:w="55" w:type="dxa"/>
+              <w:bottom w:w="78" w:type="dxa"/>
+              <w:end w:w="55" w:type="dxa"/>
             </w:tcMar>
           </w:tcPr>
           <w:p>
             <w:pPr>
-              <w:spacing w:before="0" w:after="0" w:line="216" w:lineRule="auto"/>
+              <w:spacing w:before="0" w:after="0" w:line="235" w:lineRule="auto"/>
               <w:jc w:val="left"/>
             </w:pPr>
-            <w:r/>
+            <w:r>
+              <w:rPr>
+                <w:sz w:val="15"/>
+              </w:rPr>
+            </w:r>
             <w:r>
               <w:rPr>
                 <w:rFonts w:ascii="Noto Sans CJK SC" w:hAnsi="Noto Sans CJK SC" w:eastAsia="Noto Sans CJK SC"/>
                 <w:b w:val="0"/>
                 <w:color w:val="1F2933"/>
-                <w:sz w:val="12"/>
+                <w:sz w:val="15"/>
               </w:rPr>
               <w:t>盖章说明或邮件/纪要</w:t>
             </w:r>
@@ -1539,24 +1741,28 @@
             <w:tcW w:type="dxa" w:w="1843"/>
             <w:vAlign w:val="center"/>
             <w:tcMar>
-              <w:top w:w="35" w:type="dxa"/>
-              <w:start w:w="45" w:type="dxa"/>
-              <w:bottom w:w="35" w:type="dxa"/>
-              <w:end w:w="45" w:type="dxa"/>
+              <w:top w:w="78" w:type="dxa"/>
+              <w:start w:w="55" w:type="dxa"/>
+              <w:bottom w:w="78" w:type="dxa"/>
+              <w:end w:w="55" w:type="dxa"/>
             </w:tcMar>
           </w:tcPr>
           <w:p>
             <w:pPr>
-              <w:spacing w:before="0" w:after="0" w:line="216" w:lineRule="auto"/>
+              <w:spacing w:before="0" w:after="0" w:line="235" w:lineRule="auto"/>
               <w:jc w:val="left"/>
             </w:pPr>
-            <w:r/>
+            <w:r>
+              <w:rPr>
+                <w:sz w:val="15"/>
+              </w:rPr>
+            </w:r>
             <w:r>
               <w:rPr>
                 <w:rFonts w:ascii="Noto Sans CJK SC" w:hAnsi="Noto Sans CJK SC" w:eastAsia="Noto Sans CJK SC"/>
                 <w:b w:val="0"/>
                 <w:color w:val="1F2933"/>
-                <w:sz w:val="12"/>
+                <w:sz w:val="15"/>
               </w:rPr>
               <w:t>申报准备路径无法对齐</w:t>
             </w:r>
@@ -1569,6 +1775,9 @@
         <w:pStyle w:val="SectionCompact"/>
       </w:pPr>
       <w:r>
+        <w:rPr>
+          <w:sz w:val="20"/>
+        </w:rPr>
         <w:t>加分项</w:t>
       </w:r>
     </w:p>
@@ -1597,24 +1806,28 @@
             <w:shd w:fill="1F4E78"/>
             <w:vAlign w:val="center"/>
             <w:tcMar>
-              <w:top w:w="35" w:type="dxa"/>
-              <w:start w:w="45" w:type="dxa"/>
-              <w:bottom w:w="35" w:type="dxa"/>
-              <w:end w:w="45" w:type="dxa"/>
+              <w:top w:w="78" w:type="dxa"/>
+              <w:start w:w="55" w:type="dxa"/>
+              <w:bottom w:w="78" w:type="dxa"/>
+              <w:end w:w="55" w:type="dxa"/>
             </w:tcMar>
           </w:tcPr>
           <w:p>
             <w:pPr>
-              <w:spacing w:before="0" w:after="0" w:line="216" w:lineRule="auto"/>
+              <w:spacing w:before="0" w:after="0" w:line="235" w:lineRule="auto"/>
               <w:jc w:val="center"/>
             </w:pPr>
-            <w:r/>
+            <w:r>
+              <w:rPr>
+                <w:sz w:val="15"/>
+              </w:rPr>
+            </w:r>
             <w:r>
               <w:rPr>
                 <w:rFonts w:ascii="Noto Sans CJK SC" w:hAnsi="Noto Sans CJK SC" w:eastAsia="Noto Sans CJK SC"/>
                 <w:b/>
                 <w:color w:val="FFFFFF"/>
-                <w:sz w:val="12"/>
+                <w:sz w:val="15"/>
               </w:rPr>
               <w:t>编号</w:t>
             </w:r>
@@ -1626,24 +1839,28 @@
             <w:shd w:fill="1F4E78"/>
             <w:vAlign w:val="center"/>
             <w:tcMar>
-              <w:top w:w="35" w:type="dxa"/>
-              <w:start w:w="45" w:type="dxa"/>
-              <w:bottom w:w="35" w:type="dxa"/>
-              <w:end w:w="45" w:type="dxa"/>
+              <w:top w:w="78" w:type="dxa"/>
+              <w:start w:w="55" w:type="dxa"/>
+              <w:bottom w:w="78" w:type="dxa"/>
+              <w:end w:w="55" w:type="dxa"/>
             </w:tcMar>
           </w:tcPr>
           <w:p>
             <w:pPr>
-              <w:spacing w:before="0" w:after="0" w:line="216" w:lineRule="auto"/>
+              <w:spacing w:before="0" w:after="0" w:line="235" w:lineRule="auto"/>
               <w:jc w:val="center"/>
             </w:pPr>
-            <w:r/>
+            <w:r>
+              <w:rPr>
+                <w:sz w:val="15"/>
+              </w:rPr>
+            </w:r>
             <w:r>
               <w:rPr>
                 <w:rFonts w:ascii="Noto Sans CJK SC" w:hAnsi="Noto Sans CJK SC" w:eastAsia="Noto Sans CJK SC"/>
                 <w:b/>
                 <w:color w:val="FFFFFF"/>
-                <w:sz w:val="12"/>
+                <w:sz w:val="15"/>
               </w:rPr>
               <w:t>请提供</w:t>
             </w:r>
@@ -1655,24 +1872,28 @@
             <w:shd w:fill="1F4E78"/>
             <w:vAlign w:val="center"/>
             <w:tcMar>
-              <w:top w:w="35" w:type="dxa"/>
-              <w:start w:w="45" w:type="dxa"/>
-              <w:bottom w:w="35" w:type="dxa"/>
-              <w:end w:w="45" w:type="dxa"/>
+              <w:top w:w="78" w:type="dxa"/>
+              <w:start w:w="55" w:type="dxa"/>
+              <w:bottom w:w="78" w:type="dxa"/>
+              <w:end w:w="55" w:type="dxa"/>
             </w:tcMar>
           </w:tcPr>
           <w:p>
             <w:pPr>
-              <w:spacing w:before="0" w:after="0" w:line="216" w:lineRule="auto"/>
+              <w:spacing w:before="0" w:after="0" w:line="235" w:lineRule="auto"/>
               <w:jc w:val="center"/>
             </w:pPr>
-            <w:r/>
+            <w:r>
+              <w:rPr>
+                <w:sz w:val="15"/>
+              </w:rPr>
+            </w:r>
             <w:r>
               <w:rPr>
                 <w:rFonts w:ascii="Noto Sans CJK SC" w:hAnsi="Noto Sans CJK SC" w:eastAsia="Noto Sans CJK SC"/>
                 <w:b/>
                 <w:color w:val="FFFFFF"/>
-                <w:sz w:val="12"/>
+                <w:sz w:val="15"/>
               </w:rPr>
               <w:t>用途</w:t>
             </w:r>
@@ -1684,24 +1905,28 @@
             <w:shd w:fill="1F4E78"/>
             <w:vAlign w:val="center"/>
             <w:tcMar>
-              <w:top w:w="35" w:type="dxa"/>
-              <w:start w:w="45" w:type="dxa"/>
-              <w:bottom w:w="35" w:type="dxa"/>
-              <w:end w:w="45" w:type="dxa"/>
+              <w:top w:w="78" w:type="dxa"/>
+              <w:start w:w="55" w:type="dxa"/>
+              <w:bottom w:w="78" w:type="dxa"/>
+              <w:end w:w="55" w:type="dxa"/>
             </w:tcMar>
           </w:tcPr>
           <w:p>
             <w:pPr>
-              <w:spacing w:before="0" w:after="0" w:line="216" w:lineRule="auto"/>
+              <w:spacing w:before="0" w:after="0" w:line="235" w:lineRule="auto"/>
               <w:jc w:val="center"/>
             </w:pPr>
-            <w:r/>
+            <w:r>
+              <w:rPr>
+                <w:sz w:val="15"/>
+              </w:rPr>
+            </w:r>
             <w:r>
               <w:rPr>
                 <w:rFonts w:ascii="Noto Sans CJK SC" w:hAnsi="Noto Sans CJK SC" w:eastAsia="Noto Sans CJK SC"/>
                 <w:b/>
                 <w:color w:val="FFFFFF"/>
-                <w:sz w:val="12"/>
+                <w:sz w:val="15"/>
               </w:rPr>
               <w:t>格式</w:t>
             </w:r>
@@ -1717,24 +1942,28 @@
             <w:tcW w:type="dxa" w:w="1644"/>
             <w:vAlign w:val="center"/>
             <w:tcMar>
-              <w:top w:w="35" w:type="dxa"/>
-              <w:start w:w="45" w:type="dxa"/>
-              <w:bottom w:w="35" w:type="dxa"/>
-              <w:end w:w="45" w:type="dxa"/>
+              <w:top w:w="78" w:type="dxa"/>
+              <w:start w:w="55" w:type="dxa"/>
+              <w:bottom w:w="78" w:type="dxa"/>
+              <w:end w:w="55" w:type="dxa"/>
             </w:tcMar>
           </w:tcPr>
           <w:p>
             <w:pPr>
-              <w:spacing w:before="0" w:after="0" w:line="216" w:lineRule="auto"/>
+              <w:spacing w:before="0" w:after="0" w:line="235" w:lineRule="auto"/>
               <w:jc w:val="left"/>
             </w:pPr>
-            <w:r/>
+            <w:r>
+              <w:rPr>
+                <w:sz w:val="15"/>
+              </w:rPr>
+            </w:r>
             <w:r>
               <w:rPr>
                 <w:rFonts w:ascii="Noto Sans CJK SC" w:hAnsi="Noto Sans CJK SC" w:eastAsia="Noto Sans CJK SC"/>
                 <w:b/>
                 <w:color w:val="1F2933"/>
-                <w:sz w:val="12"/>
+                <w:sz w:val="15"/>
               </w:rPr>
               <w:t>B1 工艺用能</w:t>
             </w:r>
@@ -1745,24 +1974,28 @@
             <w:tcW w:type="dxa" w:w="4649"/>
             <w:vAlign w:val="center"/>
             <w:tcMar>
-              <w:top w:w="35" w:type="dxa"/>
-              <w:start w:w="45" w:type="dxa"/>
-              <w:bottom w:w="35" w:type="dxa"/>
-              <w:end w:w="45" w:type="dxa"/>
+              <w:top w:w="78" w:type="dxa"/>
+              <w:start w:w="55" w:type="dxa"/>
+              <w:bottom w:w="78" w:type="dxa"/>
+              <w:end w:w="55" w:type="dxa"/>
             </w:tcMar>
           </w:tcPr>
           <w:p>
             <w:pPr>
-              <w:spacing w:before="0" w:after="0" w:line="216" w:lineRule="auto"/>
+              <w:spacing w:before="0" w:after="0" w:line="235" w:lineRule="auto"/>
               <w:jc w:val="left"/>
             </w:pPr>
-            <w:r/>
+            <w:r>
+              <w:rPr>
+                <w:sz w:val="15"/>
+              </w:rPr>
+            </w:r>
             <w:r>
               <w:rPr>
                 <w:rFonts w:ascii="Noto Sans CJK SC" w:hAnsi="Noto Sans CJK SC" w:eastAsia="Noto Sans CJK SC"/>
                 <w:b w:val="0"/>
                 <w:color w:val="1F2933"/>
-                <w:sz w:val="12"/>
+                <w:sz w:val="15"/>
               </w:rPr>
               <w:t>喷涂、维修、空压等设备及能耗</w:t>
             </w:r>
@@ -1773,24 +2006,28 @@
             <w:tcW w:type="dxa" w:w="2324"/>
             <w:vAlign w:val="center"/>
             <w:tcMar>
-              <w:top w:w="35" w:type="dxa"/>
-              <w:start w:w="45" w:type="dxa"/>
-              <w:bottom w:w="35" w:type="dxa"/>
-              <w:end w:w="45" w:type="dxa"/>
+              <w:top w:w="78" w:type="dxa"/>
+              <w:start w:w="55" w:type="dxa"/>
+              <w:bottom w:w="78" w:type="dxa"/>
+              <w:end w:w="55" w:type="dxa"/>
             </w:tcMar>
           </w:tcPr>
           <w:p>
             <w:pPr>
-              <w:spacing w:before="0" w:after="0" w:line="216" w:lineRule="auto"/>
+              <w:spacing w:before="0" w:after="0" w:line="235" w:lineRule="auto"/>
               <w:jc w:val="left"/>
             </w:pPr>
-            <w:r/>
+            <w:r>
+              <w:rPr>
+                <w:sz w:val="15"/>
+              </w:rPr>
+            </w:r>
             <w:r>
               <w:rPr>
                 <w:rFonts w:ascii="Noto Sans CJK SC" w:hAnsi="Noto Sans CJK SC" w:eastAsia="Noto Sans CJK SC"/>
                 <w:b w:val="0"/>
                 <w:color w:val="1F2933"/>
-                <w:sz w:val="12"/>
+                <w:sz w:val="15"/>
               </w:rPr>
               <w:t>补齐工艺负荷</w:t>
             </w:r>
@@ -1801,24 +2038,28 @@
             <w:tcW w:type="dxa" w:w="2211"/>
             <w:vAlign w:val="center"/>
             <w:tcMar>
-              <w:top w:w="35" w:type="dxa"/>
-              <w:start w:w="45" w:type="dxa"/>
-              <w:bottom w:w="35" w:type="dxa"/>
-              <w:end w:w="45" w:type="dxa"/>
+              <w:top w:w="78" w:type="dxa"/>
+              <w:start w:w="55" w:type="dxa"/>
+              <w:bottom w:w="78" w:type="dxa"/>
+              <w:end w:w="55" w:type="dxa"/>
             </w:tcMar>
           </w:tcPr>
           <w:p>
             <w:pPr>
-              <w:spacing w:before="0" w:after="0" w:line="216" w:lineRule="auto"/>
+              <w:spacing w:before="0" w:after="0" w:line="235" w:lineRule="auto"/>
               <w:jc w:val="left"/>
             </w:pPr>
-            <w:r/>
+            <w:r>
+              <w:rPr>
+                <w:sz w:val="15"/>
+              </w:rPr>
+            </w:r>
             <w:r>
               <w:rPr>
                 <w:rFonts w:ascii="Noto Sans CJK SC" w:hAnsi="Noto Sans CJK SC" w:eastAsia="Noto Sans CJK SC"/>
                 <w:b w:val="0"/>
                 <w:color w:val="1F2933"/>
-                <w:sz w:val="12"/>
+                <w:sz w:val="15"/>
               </w:rPr>
               <w:t>Excel/图纸</w:t>
             </w:r>
@@ -1835,24 +2076,28 @@
             <w:shd w:fill="F4F7FA"/>
             <w:vAlign w:val="center"/>
             <w:tcMar>
-              <w:top w:w="35" w:type="dxa"/>
-              <w:start w:w="45" w:type="dxa"/>
-              <w:bottom w:w="35" w:type="dxa"/>
-              <w:end w:w="45" w:type="dxa"/>
+              <w:top w:w="78" w:type="dxa"/>
+              <w:start w:w="55" w:type="dxa"/>
+              <w:bottom w:w="78" w:type="dxa"/>
+              <w:end w:w="55" w:type="dxa"/>
             </w:tcMar>
           </w:tcPr>
           <w:p>
             <w:pPr>
-              <w:spacing w:before="0" w:after="0" w:line="216" w:lineRule="auto"/>
+              <w:spacing w:before="0" w:after="0" w:line="235" w:lineRule="auto"/>
               <w:jc w:val="left"/>
             </w:pPr>
-            <w:r/>
+            <w:r>
+              <w:rPr>
+                <w:sz w:val="15"/>
+              </w:rPr>
+            </w:r>
             <w:r>
               <w:rPr>
                 <w:rFonts w:ascii="Noto Sans CJK SC" w:hAnsi="Noto Sans CJK SC" w:eastAsia="Noto Sans CJK SC"/>
                 <w:b/>
                 <w:color w:val="1F2933"/>
-                <w:sz w:val="12"/>
+                <w:sz w:val="15"/>
               </w:rPr>
               <w:t>B2 充电桩</w:t>
             </w:r>
@@ -1864,24 +2109,28 @@
             <w:shd w:fill="F4F7FA"/>
             <w:vAlign w:val="center"/>
             <w:tcMar>
-              <w:top w:w="35" w:type="dxa"/>
-              <w:start w:w="45" w:type="dxa"/>
-              <w:bottom w:w="35" w:type="dxa"/>
-              <w:end w:w="45" w:type="dxa"/>
+              <w:top w:w="78" w:type="dxa"/>
+              <w:start w:w="55" w:type="dxa"/>
+              <w:bottom w:w="78" w:type="dxa"/>
+              <w:end w:w="55" w:type="dxa"/>
             </w:tcMar>
           </w:tcPr>
           <w:p>
             <w:pPr>
-              <w:spacing w:before="0" w:after="0" w:line="216" w:lineRule="auto"/>
+              <w:spacing w:before="0" w:after="0" w:line="235" w:lineRule="auto"/>
               <w:jc w:val="left"/>
             </w:pPr>
-            <w:r/>
+            <w:r>
+              <w:rPr>
+                <w:sz w:val="15"/>
+              </w:rPr>
+            </w:r>
             <w:r>
               <w:rPr>
                 <w:rFonts w:ascii="Noto Sans CJK SC" w:hAnsi="Noto Sans CJK SC" w:eastAsia="Noto Sans CJK SC"/>
                 <w:b w:val="0"/>
                 <w:color w:val="1F2933"/>
-                <w:sz w:val="12"/>
+                <w:sz w:val="15"/>
               </w:rPr>
               <w:t>数量、功率、电量、运营主体与扩建计划</w:t>
             </w:r>
@@ -1893,24 +2142,28 @@
             <w:shd w:fill="F4F7FA"/>
             <w:vAlign w:val="center"/>
             <w:tcMar>
-              <w:top w:w="35" w:type="dxa"/>
-              <w:start w:w="45" w:type="dxa"/>
-              <w:bottom w:w="35" w:type="dxa"/>
-              <w:end w:w="45" w:type="dxa"/>
+              <w:top w:w="78" w:type="dxa"/>
+              <w:start w:w="55" w:type="dxa"/>
+              <w:bottom w:w="78" w:type="dxa"/>
+              <w:end w:w="55" w:type="dxa"/>
             </w:tcMar>
           </w:tcPr>
           <w:p>
             <w:pPr>
-              <w:spacing w:before="0" w:after="0" w:line="216" w:lineRule="auto"/>
+              <w:spacing w:before="0" w:after="0" w:line="235" w:lineRule="auto"/>
               <w:jc w:val="left"/>
             </w:pPr>
-            <w:r/>
+            <w:r>
+              <w:rPr>
+                <w:sz w:val="15"/>
+              </w:rPr>
+            </w:r>
             <w:r>
               <w:rPr>
                 <w:rFonts w:ascii="Noto Sans CJK SC" w:hAnsi="Noto Sans CJK SC" w:eastAsia="Noto Sans CJK SC"/>
                 <w:b w:val="0"/>
                 <w:color w:val="1F2933"/>
-                <w:sz w:val="12"/>
+                <w:sz w:val="15"/>
               </w:rPr>
               <w:t>评估柔性负荷</w:t>
             </w:r>
@@ -1922,24 +2175,28 @@
             <w:shd w:fill="F4F7FA"/>
             <w:vAlign w:val="center"/>
             <w:tcMar>
-              <w:top w:w="35" w:type="dxa"/>
-              <w:start w:w="45" w:type="dxa"/>
-              <w:bottom w:w="35" w:type="dxa"/>
-              <w:end w:w="45" w:type="dxa"/>
+              <w:top w:w="78" w:type="dxa"/>
+              <w:start w:w="55" w:type="dxa"/>
+              <w:bottom w:w="78" w:type="dxa"/>
+              <w:end w:w="55" w:type="dxa"/>
             </w:tcMar>
           </w:tcPr>
           <w:p>
             <w:pPr>
-              <w:spacing w:before="0" w:after="0" w:line="216" w:lineRule="auto"/>
+              <w:spacing w:before="0" w:after="0" w:line="235" w:lineRule="auto"/>
               <w:jc w:val="left"/>
             </w:pPr>
-            <w:r/>
+            <w:r>
+              <w:rPr>
+                <w:sz w:val="15"/>
+              </w:rPr>
+            </w:r>
             <w:r>
               <w:rPr>
                 <w:rFonts w:ascii="Noto Sans CJK SC" w:hAnsi="Noto Sans CJK SC" w:eastAsia="Noto Sans CJK SC"/>
                 <w:b w:val="0"/>
                 <w:color w:val="1F2933"/>
-                <w:sz w:val="12"/>
+                <w:sz w:val="15"/>
               </w:rPr>
               <w:t>Excel/合同摘要</w:t>
             </w:r>
@@ -1955,24 +2212,28 @@
             <w:tcW w:type="dxa" w:w="1644"/>
             <w:vAlign w:val="center"/>
             <w:tcMar>
-              <w:top w:w="35" w:type="dxa"/>
-              <w:start w:w="45" w:type="dxa"/>
-              <w:bottom w:w="35" w:type="dxa"/>
-              <w:end w:w="45" w:type="dxa"/>
+              <w:top w:w="78" w:type="dxa"/>
+              <w:start w:w="55" w:type="dxa"/>
+              <w:bottom w:w="78" w:type="dxa"/>
+              <w:end w:w="55" w:type="dxa"/>
             </w:tcMar>
           </w:tcPr>
           <w:p>
             <w:pPr>
-              <w:spacing w:before="0" w:after="0" w:line="216" w:lineRule="auto"/>
+              <w:spacing w:before="0" w:after="0" w:line="235" w:lineRule="auto"/>
               <w:jc w:val="left"/>
             </w:pPr>
-            <w:r/>
+            <w:r>
+              <w:rPr>
+                <w:sz w:val="15"/>
+              </w:rPr>
+            </w:r>
             <w:r>
               <w:rPr>
                 <w:rFonts w:ascii="Noto Sans CJK SC" w:hAnsi="Noto Sans CJK SC" w:eastAsia="Noto Sans CJK SC"/>
                 <w:b/>
                 <w:color w:val="1F2933"/>
-                <w:sz w:val="12"/>
+                <w:sz w:val="15"/>
               </w:rPr>
               <w:t>B3 绿电/绿证</w:t>
             </w:r>
@@ -1983,24 +2244,28 @@
             <w:tcW w:type="dxa" w:w="4649"/>
             <w:vAlign w:val="center"/>
             <w:tcMar>
-              <w:top w:w="35" w:type="dxa"/>
-              <w:start w:w="45" w:type="dxa"/>
-              <w:bottom w:w="35" w:type="dxa"/>
-              <w:end w:w="45" w:type="dxa"/>
+              <w:top w:w="78" w:type="dxa"/>
+              <w:start w:w="55" w:type="dxa"/>
+              <w:bottom w:w="78" w:type="dxa"/>
+              <w:end w:w="55" w:type="dxa"/>
             </w:tcMar>
           </w:tcPr>
           <w:p>
             <w:pPr>
-              <w:spacing w:before="0" w:after="0" w:line="216" w:lineRule="auto"/>
+              <w:spacing w:before="0" w:after="0" w:line="235" w:lineRule="auto"/>
               <w:jc w:val="left"/>
             </w:pPr>
-            <w:r/>
+            <w:r>
+              <w:rPr>
+                <w:sz w:val="15"/>
+              </w:rPr>
+            </w:r>
             <w:r>
               <w:rPr>
                 <w:rFonts w:ascii="Noto Sans CJK SC" w:hAnsi="Noto Sans CJK SC" w:eastAsia="Noto Sans CJK SC"/>
                 <w:b w:val="0"/>
                 <w:color w:val="1F2933"/>
-                <w:sz w:val="12"/>
+                <w:sz w:val="15"/>
               </w:rPr>
               <w:t>合同、购电主体、覆盖期/电量及结算或核销凭证；绿证≠物理认定量/直连</w:t>
             </w:r>
@@ -2011,24 +2276,28 @@
             <w:tcW w:type="dxa" w:w="2324"/>
             <w:vAlign w:val="center"/>
             <w:tcMar>
-              <w:top w:w="35" w:type="dxa"/>
-              <w:start w:w="45" w:type="dxa"/>
-              <w:bottom w:w="35" w:type="dxa"/>
-              <w:end w:w="45" w:type="dxa"/>
+              <w:top w:w="78" w:type="dxa"/>
+              <w:start w:w="55" w:type="dxa"/>
+              <w:bottom w:w="78" w:type="dxa"/>
+              <w:end w:w="55" w:type="dxa"/>
             </w:tcMar>
           </w:tcPr>
           <w:p>
             <w:pPr>
-              <w:spacing w:before="0" w:after="0" w:line="216" w:lineRule="auto"/>
+              <w:spacing w:before="0" w:after="0" w:line="235" w:lineRule="auto"/>
               <w:jc w:val="left"/>
             </w:pPr>
-            <w:r/>
+            <w:r>
+              <w:rPr>
+                <w:sz w:val="15"/>
+              </w:rPr>
+            </w:r>
             <w:r>
               <w:rPr>
                 <w:rFonts w:ascii="Noto Sans CJK SC" w:hAnsi="Noto Sans CJK SC" w:eastAsia="Noto Sans CJK SC"/>
                 <w:b w:val="0"/>
                 <w:color w:val="1F2933"/>
-                <w:sz w:val="12"/>
+                <w:sz w:val="15"/>
               </w:rPr>
               <w:t>核对环境权益边界</w:t>
             </w:r>
@@ -2039,24 +2308,28 @@
             <w:tcW w:type="dxa" w:w="2211"/>
             <w:vAlign w:val="center"/>
             <w:tcMar>
-              <w:top w:w="35" w:type="dxa"/>
-              <w:start w:w="45" w:type="dxa"/>
-              <w:bottom w:w="35" w:type="dxa"/>
-              <w:end w:w="45" w:type="dxa"/>
+              <w:top w:w="78" w:type="dxa"/>
+              <w:start w:w="55" w:type="dxa"/>
+              <w:bottom w:w="78" w:type="dxa"/>
+              <w:end w:w="55" w:type="dxa"/>
             </w:tcMar>
           </w:tcPr>
           <w:p>
             <w:pPr>
-              <w:spacing w:before="0" w:after="0" w:line="216" w:lineRule="auto"/>
+              <w:spacing w:before="0" w:after="0" w:line="235" w:lineRule="auto"/>
               <w:jc w:val="left"/>
             </w:pPr>
-            <w:r/>
+            <w:r>
+              <w:rPr>
+                <w:sz w:val="15"/>
+              </w:rPr>
+            </w:r>
             <w:r>
               <w:rPr>
                 <w:rFonts w:ascii="Noto Sans CJK SC" w:hAnsi="Noto Sans CJK SC" w:eastAsia="Noto Sans CJK SC"/>
                 <w:b w:val="0"/>
                 <w:color w:val="1F2933"/>
-                <w:sz w:val="12"/>
+                <w:sz w:val="15"/>
               </w:rPr>
               <w:t>PDF＋Excel</w:t>
             </w:r>
@@ -2073,24 +2346,28 @@
             <w:shd w:fill="F4F7FA"/>
             <w:vAlign w:val="center"/>
             <w:tcMar>
-              <w:top w:w="35" w:type="dxa"/>
-              <w:start w:w="45" w:type="dxa"/>
-              <w:bottom w:w="35" w:type="dxa"/>
-              <w:end w:w="45" w:type="dxa"/>
+              <w:top w:w="78" w:type="dxa"/>
+              <w:start w:w="55" w:type="dxa"/>
+              <w:bottom w:w="78" w:type="dxa"/>
+              <w:end w:w="55" w:type="dxa"/>
             </w:tcMar>
           </w:tcPr>
           <w:p>
             <w:pPr>
-              <w:spacing w:before="0" w:after="0" w:line="216" w:lineRule="auto"/>
+              <w:spacing w:before="0" w:after="0" w:line="235" w:lineRule="auto"/>
               <w:jc w:val="left"/>
             </w:pPr>
-            <w:r/>
+            <w:r>
+              <w:rPr>
+                <w:sz w:val="15"/>
+              </w:rPr>
+            </w:r>
             <w:r>
               <w:rPr>
                 <w:rFonts w:ascii="Noto Sans CJK SC" w:hAnsi="Noto Sans CJK SC" w:eastAsia="Noto Sans CJK SC"/>
                 <w:b/>
                 <w:color w:val="1F2933"/>
-                <w:sz w:val="12"/>
+                <w:sz w:val="15"/>
               </w:rPr>
               <w:t>B4 储能蓄冷</w:t>
             </w:r>
@@ -2102,24 +2379,28 @@
             <w:shd w:fill="F4F7FA"/>
             <w:vAlign w:val="center"/>
             <w:tcMar>
-              <w:top w:w="35" w:type="dxa"/>
-              <w:start w:w="45" w:type="dxa"/>
-              <w:bottom w:w="35" w:type="dxa"/>
-              <w:end w:w="45" w:type="dxa"/>
+              <w:top w:w="78" w:type="dxa"/>
+              <w:start w:w="55" w:type="dxa"/>
+              <w:bottom w:w="78" w:type="dxa"/>
+              <w:end w:w="55" w:type="dxa"/>
             </w:tcMar>
           </w:tcPr>
           <w:p>
             <w:pPr>
-              <w:spacing w:before="0" w:after="0" w:line="216" w:lineRule="auto"/>
+              <w:spacing w:before="0" w:after="0" w:line="235" w:lineRule="auto"/>
               <w:jc w:val="left"/>
             </w:pPr>
-            <w:r/>
+            <w:r>
+              <w:rPr>
+                <w:sz w:val="15"/>
+              </w:rPr>
+            </w:r>
             <w:r>
               <w:rPr>
                 <w:rFonts w:ascii="Noto Sans CJK SC" w:hAnsi="Noto Sans CJK SC" w:eastAsia="Noto Sans CJK SC"/>
                 <w:b w:val="0"/>
                 <w:color w:val="1F2933"/>
-                <w:sz w:val="12"/>
+                <w:sz w:val="15"/>
               </w:rPr>
               <w:t>参数、运行曲线、收益归属与消防资料</w:t>
             </w:r>
@@ -2131,24 +2412,28 @@
             <w:shd w:fill="F4F7FA"/>
             <w:vAlign w:val="center"/>
             <w:tcMar>
-              <w:top w:w="35" w:type="dxa"/>
-              <w:start w:w="45" w:type="dxa"/>
-              <w:bottom w:w="35" w:type="dxa"/>
-              <w:end w:w="45" w:type="dxa"/>
+              <w:top w:w="78" w:type="dxa"/>
+              <w:start w:w="55" w:type="dxa"/>
+              <w:bottom w:w="78" w:type="dxa"/>
+              <w:end w:w="55" w:type="dxa"/>
             </w:tcMar>
           </w:tcPr>
           <w:p>
             <w:pPr>
-              <w:spacing w:before="0" w:after="0" w:line="216" w:lineRule="auto"/>
+              <w:spacing w:before="0" w:after="0" w:line="235" w:lineRule="auto"/>
               <w:jc w:val="left"/>
             </w:pPr>
-            <w:r/>
+            <w:r>
+              <w:rPr>
+                <w:sz w:val="15"/>
+              </w:rPr>
+            </w:r>
             <w:r>
               <w:rPr>
                 <w:rFonts w:ascii="Noto Sans CJK SC" w:hAnsi="Noto Sans CJK SC" w:eastAsia="Noto Sans CJK SC"/>
                 <w:b w:val="0"/>
                 <w:color w:val="1F2933"/>
-                <w:sz w:val="12"/>
+                <w:sz w:val="15"/>
               </w:rPr>
               <w:t>评估调节能力</w:t>
             </w:r>
@@ -2160,24 +2445,28 @@
             <w:shd w:fill="F4F7FA"/>
             <w:vAlign w:val="center"/>
             <w:tcMar>
-              <w:top w:w="35" w:type="dxa"/>
-              <w:start w:w="45" w:type="dxa"/>
-              <w:bottom w:w="35" w:type="dxa"/>
-              <w:end w:w="45" w:type="dxa"/>
+              <w:top w:w="78" w:type="dxa"/>
+              <w:start w:w="55" w:type="dxa"/>
+              <w:bottom w:w="78" w:type="dxa"/>
+              <w:end w:w="55" w:type="dxa"/>
             </w:tcMar>
           </w:tcPr>
           <w:p>
             <w:pPr>
-              <w:spacing w:before="0" w:after="0" w:line="216" w:lineRule="auto"/>
+              <w:spacing w:before="0" w:after="0" w:line="235" w:lineRule="auto"/>
               <w:jc w:val="left"/>
             </w:pPr>
-            <w:r/>
+            <w:r>
+              <w:rPr>
+                <w:sz w:val="15"/>
+              </w:rPr>
+            </w:r>
             <w:r>
               <w:rPr>
                 <w:rFonts w:ascii="Noto Sans CJK SC" w:hAnsi="Noto Sans CJK SC" w:eastAsia="Noto Sans CJK SC"/>
                 <w:b w:val="0"/>
                 <w:color w:val="1F2933"/>
-                <w:sz w:val="12"/>
+                <w:sz w:val="15"/>
               </w:rPr>
               <w:t>Excel/PDF</w:t>
             </w:r>
@@ -2193,24 +2482,28 @@
             <w:tcW w:type="dxa" w:w="1644"/>
             <w:vAlign w:val="center"/>
             <w:tcMar>
-              <w:top w:w="35" w:type="dxa"/>
-              <w:start w:w="45" w:type="dxa"/>
-              <w:bottom w:w="35" w:type="dxa"/>
-              <w:end w:w="45" w:type="dxa"/>
+              <w:top w:w="78" w:type="dxa"/>
+              <w:start w:w="55" w:type="dxa"/>
+              <w:bottom w:w="78" w:type="dxa"/>
+              <w:end w:w="55" w:type="dxa"/>
             </w:tcMar>
           </w:tcPr>
           <w:p>
             <w:pPr>
-              <w:spacing w:before="0" w:after="0" w:line="216" w:lineRule="auto"/>
+              <w:spacing w:before="0" w:after="0" w:line="235" w:lineRule="auto"/>
               <w:jc w:val="left"/>
             </w:pPr>
-            <w:r/>
+            <w:r>
+              <w:rPr>
+                <w:sz w:val="15"/>
+              </w:rPr>
+            </w:r>
             <w:r>
               <w:rPr>
                 <w:rFonts w:ascii="Noto Sans CJK SC" w:hAnsi="Noto Sans CJK SC" w:eastAsia="Noto Sans CJK SC"/>
                 <w:b/>
                 <w:color w:val="1F2933"/>
-                <w:sz w:val="12"/>
+                <w:sz w:val="15"/>
               </w:rPr>
               <w:t>B5 已有节能数字化</w:t>
             </w:r>
@@ -2221,24 +2514,28 @@
             <w:tcW w:type="dxa" w:w="4649"/>
             <w:vAlign w:val="center"/>
             <w:tcMar>
-              <w:top w:w="35" w:type="dxa"/>
-              <w:start w:w="45" w:type="dxa"/>
-              <w:bottom w:w="35" w:type="dxa"/>
-              <w:end w:w="45" w:type="dxa"/>
+              <w:top w:w="78" w:type="dxa"/>
+              <w:start w:w="55" w:type="dxa"/>
+              <w:bottom w:w="78" w:type="dxa"/>
+              <w:end w:w="55" w:type="dxa"/>
             </w:tcMar>
           </w:tcPr>
           <w:p>
             <w:pPr>
-              <w:spacing w:before="0" w:after="0" w:line="216" w:lineRule="auto"/>
+              <w:spacing w:before="0" w:after="0" w:line="235" w:lineRule="auto"/>
               <w:jc w:val="left"/>
             </w:pPr>
-            <w:r/>
+            <w:r>
+              <w:rPr>
+                <w:sz w:val="15"/>
+              </w:rPr>
+            </w:r>
             <w:r>
               <w:rPr>
                 <w:rFonts w:ascii="Noto Sans CJK SC" w:hAnsi="Noto Sans CJK SC" w:eastAsia="Noto Sans CJK SC"/>
                 <w:b w:val="0"/>
                 <w:color w:val="1F2933"/>
-                <w:sz w:val="12"/>
+                <w:sz w:val="15"/>
               </w:rPr>
               <w:t>改造清单、验收节能量、平台点位及截图</w:t>
             </w:r>
@@ -2249,24 +2546,28 @@
             <w:tcW w:type="dxa" w:w="2324"/>
             <w:vAlign w:val="center"/>
             <w:tcMar>
-              <w:top w:w="35" w:type="dxa"/>
-              <w:start w:w="45" w:type="dxa"/>
-              <w:bottom w:w="35" w:type="dxa"/>
-              <w:end w:w="45" w:type="dxa"/>
+              <w:top w:w="78" w:type="dxa"/>
+              <w:start w:w="55" w:type="dxa"/>
+              <w:bottom w:w="78" w:type="dxa"/>
+              <w:end w:w="55" w:type="dxa"/>
             </w:tcMar>
           </w:tcPr>
           <w:p>
             <w:pPr>
-              <w:spacing w:before="0" w:after="0" w:line="216" w:lineRule="auto"/>
+              <w:spacing w:before="0" w:after="0" w:line="235" w:lineRule="auto"/>
               <w:jc w:val="left"/>
             </w:pPr>
-            <w:r/>
+            <w:r>
+              <w:rPr>
+                <w:sz w:val="15"/>
+              </w:rPr>
+            </w:r>
             <w:r>
               <w:rPr>
                 <w:rFonts w:ascii="Noto Sans CJK SC" w:hAnsi="Noto Sans CJK SC" w:eastAsia="Noto Sans CJK SC"/>
                 <w:b w:val="0"/>
                 <w:color w:val="1F2933"/>
-                <w:sz w:val="12"/>
+                <w:sz w:val="15"/>
               </w:rPr>
               <w:t>避免重复建设</w:t>
             </w:r>
@@ -2277,24 +2578,28 @@
             <w:tcW w:type="dxa" w:w="2211"/>
             <w:vAlign w:val="center"/>
             <w:tcMar>
-              <w:top w:w="35" w:type="dxa"/>
-              <w:start w:w="45" w:type="dxa"/>
-              <w:bottom w:w="35" w:type="dxa"/>
-              <w:end w:w="45" w:type="dxa"/>
+              <w:top w:w="78" w:type="dxa"/>
+              <w:start w:w="55" w:type="dxa"/>
+              <w:bottom w:w="78" w:type="dxa"/>
+              <w:end w:w="55" w:type="dxa"/>
             </w:tcMar>
           </w:tcPr>
           <w:p>
             <w:pPr>
-              <w:spacing w:before="0" w:after="0" w:line="216" w:lineRule="auto"/>
+              <w:spacing w:before="0" w:after="0" w:line="235" w:lineRule="auto"/>
               <w:jc w:val="left"/>
             </w:pPr>
-            <w:r/>
+            <w:r>
+              <w:rPr>
+                <w:sz w:val="15"/>
+              </w:rPr>
+            </w:r>
             <w:r>
               <w:rPr>
                 <w:rFonts w:ascii="Noto Sans CJK SC" w:hAnsi="Noto Sans CJK SC" w:eastAsia="Noto Sans CJK SC"/>
                 <w:b w:val="0"/>
                 <w:color w:val="1F2933"/>
-                <w:sz w:val="12"/>
+                <w:sz w:val="15"/>
               </w:rPr>
               <w:t>Excel/报告/截图</w:t>
             </w:r>
@@ -2311,24 +2616,28 @@
             <w:shd w:fill="F4F7FA"/>
             <w:vAlign w:val="center"/>
             <w:tcMar>
-              <w:top w:w="35" w:type="dxa"/>
-              <w:start w:w="45" w:type="dxa"/>
-              <w:bottom w:w="35" w:type="dxa"/>
-              <w:end w:w="45" w:type="dxa"/>
+              <w:top w:w="78" w:type="dxa"/>
+              <w:start w:w="55" w:type="dxa"/>
+              <w:bottom w:w="78" w:type="dxa"/>
+              <w:end w:w="55" w:type="dxa"/>
             </w:tcMar>
           </w:tcPr>
           <w:p>
             <w:pPr>
-              <w:spacing w:before="0" w:after="0" w:line="216" w:lineRule="auto"/>
+              <w:spacing w:before="0" w:after="0" w:line="235" w:lineRule="auto"/>
               <w:jc w:val="left"/>
             </w:pPr>
-            <w:r/>
+            <w:r>
+              <w:rPr>
+                <w:sz w:val="15"/>
+              </w:rPr>
+            </w:r>
             <w:r>
               <w:rPr>
                 <w:rFonts w:ascii="Noto Sans CJK SC" w:hAnsi="Noto Sans CJK SC" w:eastAsia="Noto Sans CJK SC"/>
                 <w:b/>
                 <w:color w:val="1F2933"/>
-                <w:sz w:val="12"/>
+                <w:sz w:val="15"/>
               </w:rPr>
               <w:t>B6 碳排放与ESG</w:t>
             </w:r>
@@ -2340,24 +2649,28 @@
             <w:shd w:fill="F4F7FA"/>
             <w:vAlign w:val="center"/>
             <w:tcMar>
-              <w:top w:w="35" w:type="dxa"/>
-              <w:start w:w="45" w:type="dxa"/>
-              <w:bottom w:w="35" w:type="dxa"/>
-              <w:end w:w="45" w:type="dxa"/>
+              <w:top w:w="78" w:type="dxa"/>
+              <w:start w:w="55" w:type="dxa"/>
+              <w:bottom w:w="78" w:type="dxa"/>
+              <w:end w:w="55" w:type="dxa"/>
             </w:tcMar>
           </w:tcPr>
           <w:p>
             <w:pPr>
-              <w:spacing w:before="0" w:after="0" w:line="216" w:lineRule="auto"/>
+              <w:spacing w:before="0" w:after="0" w:line="235" w:lineRule="auto"/>
               <w:jc w:val="left"/>
             </w:pPr>
-            <w:r/>
+            <w:r>
+              <w:rPr>
+                <w:sz w:val="15"/>
+              </w:rPr>
+            </w:r>
             <w:r>
               <w:rPr>
                 <w:rFonts w:ascii="Noto Sans CJK SC" w:hAnsi="Noto Sans CJK SC" w:eastAsia="Noto Sans CJK SC"/>
                 <w:b w:val="0"/>
                 <w:color w:val="1F2933"/>
-                <w:sz w:val="12"/>
+                <w:sz w:val="15"/>
               </w:rPr>
               <w:t>近年盘查、排放因子、范围边界及披露材料</w:t>
             </w:r>
@@ -2369,24 +2682,28 @@
             <w:shd w:fill="F4F7FA"/>
             <w:vAlign w:val="center"/>
             <w:tcMar>
-              <w:top w:w="35" w:type="dxa"/>
-              <w:start w:w="45" w:type="dxa"/>
-              <w:bottom w:w="35" w:type="dxa"/>
-              <w:end w:w="45" w:type="dxa"/>
+              <w:top w:w="78" w:type="dxa"/>
+              <w:start w:w="55" w:type="dxa"/>
+              <w:bottom w:w="78" w:type="dxa"/>
+              <w:end w:w="55" w:type="dxa"/>
             </w:tcMar>
           </w:tcPr>
           <w:p>
             <w:pPr>
-              <w:spacing w:before="0" w:after="0" w:line="216" w:lineRule="auto"/>
+              <w:spacing w:before="0" w:after="0" w:line="235" w:lineRule="auto"/>
               <w:jc w:val="left"/>
             </w:pPr>
-            <w:r/>
+            <w:r>
+              <w:rPr>
+                <w:sz w:val="15"/>
+              </w:rPr>
+            </w:r>
             <w:r>
               <w:rPr>
                 <w:rFonts w:ascii="Noto Sans CJK SC" w:hAnsi="Noto Sans CJK SC" w:eastAsia="Noto Sans CJK SC"/>
                 <w:b w:val="0"/>
                 <w:color w:val="1F2933"/>
-                <w:sz w:val="12"/>
+                <w:sz w:val="15"/>
               </w:rPr>
               <w:t>校核碳基线</w:t>
             </w:r>
@@ -2398,24 +2715,28 @@
             <w:shd w:fill="F4F7FA"/>
             <w:vAlign w:val="center"/>
             <w:tcMar>
-              <w:top w:w="35" w:type="dxa"/>
-              <w:start w:w="45" w:type="dxa"/>
-              <w:bottom w:w="35" w:type="dxa"/>
-              <w:end w:w="45" w:type="dxa"/>
+              <w:top w:w="78" w:type="dxa"/>
+              <w:start w:w="55" w:type="dxa"/>
+              <w:bottom w:w="78" w:type="dxa"/>
+              <w:end w:w="55" w:type="dxa"/>
             </w:tcMar>
           </w:tcPr>
           <w:p>
             <w:pPr>
-              <w:spacing w:before="0" w:after="0" w:line="216" w:lineRule="auto"/>
+              <w:spacing w:before="0" w:after="0" w:line="235" w:lineRule="auto"/>
               <w:jc w:val="left"/>
             </w:pPr>
-            <w:r/>
+            <w:r>
+              <w:rPr>
+                <w:sz w:val="15"/>
+              </w:rPr>
+            </w:r>
             <w:r>
               <w:rPr>
                 <w:rFonts w:ascii="Noto Sans CJK SC" w:hAnsi="Noto Sans CJK SC" w:eastAsia="Noto Sans CJK SC"/>
                 <w:b w:val="0"/>
                 <w:color w:val="1F2933"/>
-                <w:sz w:val="12"/>
+                <w:sz w:val="15"/>
               </w:rPr>
               <w:t>报告PDF＋底表Excel</w:t>
             </w:r>
@@ -2431,24 +2752,28 @@
             <w:tcW w:type="dxa" w:w="1644"/>
             <w:vAlign w:val="center"/>
             <w:tcMar>
-              <w:top w:w="35" w:type="dxa"/>
-              <w:start w:w="45" w:type="dxa"/>
-              <w:bottom w:w="35" w:type="dxa"/>
-              <w:end w:w="45" w:type="dxa"/>
+              <w:top w:w="78" w:type="dxa"/>
+              <w:start w:w="55" w:type="dxa"/>
+              <w:bottom w:w="78" w:type="dxa"/>
+              <w:end w:w="55" w:type="dxa"/>
             </w:tcMar>
           </w:tcPr>
           <w:p>
             <w:pPr>
-              <w:spacing w:before="0" w:after="0" w:line="216" w:lineRule="auto"/>
+              <w:spacing w:before="0" w:after="0" w:line="235" w:lineRule="auto"/>
               <w:jc w:val="left"/>
             </w:pPr>
-            <w:r/>
+            <w:r>
+              <w:rPr>
+                <w:sz w:val="15"/>
+              </w:rPr>
+            </w:r>
             <w:r>
               <w:rPr>
                 <w:rFonts w:ascii="Noto Sans CJK SC" w:hAnsi="Noto Sans CJK SC" w:eastAsia="Noto Sans CJK SC"/>
                 <w:b/>
                 <w:color w:val="1F2933"/>
-                <w:sz w:val="12"/>
+                <w:sz w:val="15"/>
               </w:rPr>
               <w:t>B7 投资运维界面</w:t>
             </w:r>
@@ -2459,24 +2784,28 @@
             <w:tcW w:type="dxa" w:w="4649"/>
             <w:vAlign w:val="center"/>
             <w:tcMar>
-              <w:top w:w="35" w:type="dxa"/>
-              <w:start w:w="45" w:type="dxa"/>
-              <w:bottom w:w="35" w:type="dxa"/>
-              <w:end w:w="45" w:type="dxa"/>
+              <w:top w:w="78" w:type="dxa"/>
+              <w:start w:w="55" w:type="dxa"/>
+              <w:bottom w:w="78" w:type="dxa"/>
+              <w:end w:w="55" w:type="dxa"/>
             </w:tcMar>
           </w:tcPr>
           <w:p>
             <w:pPr>
-              <w:spacing w:before="0" w:after="0" w:line="216" w:lineRule="auto"/>
+              <w:spacing w:before="0" w:after="0" w:line="235" w:lineRule="auto"/>
               <w:jc w:val="left"/>
             </w:pPr>
-            <w:r/>
+            <w:r>
+              <w:rPr>
+                <w:sz w:val="15"/>
+              </w:rPr>
+            </w:r>
             <w:r>
               <w:rPr>
                 <w:rFonts w:ascii="Noto Sans CJK SC" w:hAnsi="Noto Sans CJK SC" w:eastAsia="Noto Sans CJK SC"/>
                 <w:b w:val="0"/>
                 <w:color w:val="1F2933"/>
-                <w:sz w:val="12"/>
+                <w:sz w:val="15"/>
               </w:rPr>
               <w:t>南航/服务方/第三方的投资、资产、运维及收益边界</w:t>
             </w:r>
@@ -2487,24 +2816,28 @@
             <w:tcW w:type="dxa" w:w="2324"/>
             <w:vAlign w:val="center"/>
             <w:tcMar>
-              <w:top w:w="35" w:type="dxa"/>
-              <w:start w:w="45" w:type="dxa"/>
-              <w:bottom w:w="35" w:type="dxa"/>
-              <w:end w:w="45" w:type="dxa"/>
+              <w:top w:w="78" w:type="dxa"/>
+              <w:start w:w="55" w:type="dxa"/>
+              <w:bottom w:w="78" w:type="dxa"/>
+              <w:end w:w="55" w:type="dxa"/>
             </w:tcMar>
           </w:tcPr>
           <w:p>
             <w:pPr>
-              <w:spacing w:before="0" w:after="0" w:line="216" w:lineRule="auto"/>
+              <w:spacing w:before="0" w:after="0" w:line="235" w:lineRule="auto"/>
               <w:jc w:val="left"/>
             </w:pPr>
-            <w:r/>
+            <w:r>
+              <w:rPr>
+                <w:sz w:val="15"/>
+              </w:rPr>
+            </w:r>
             <w:r>
               <w:rPr>
                 <w:rFonts w:ascii="Noto Sans CJK SC" w:hAnsi="Noto Sans CJK SC" w:eastAsia="Noto Sans CJK SC"/>
                 <w:b w:val="0"/>
                 <w:color w:val="1F2933"/>
-                <w:sz w:val="12"/>
+                <w:sz w:val="15"/>
               </w:rPr>
               <w:t>形成可执行方案</w:t>
             </w:r>
@@ -2515,24 +2848,28 @@
             <w:tcW w:type="dxa" w:w="2211"/>
             <w:vAlign w:val="center"/>
             <w:tcMar>
-              <w:top w:w="35" w:type="dxa"/>
-              <w:start w:w="45" w:type="dxa"/>
-              <w:bottom w:w="35" w:type="dxa"/>
-              <w:end w:w="45" w:type="dxa"/>
+              <w:top w:w="78" w:type="dxa"/>
+              <w:start w:w="55" w:type="dxa"/>
+              <w:bottom w:w="78" w:type="dxa"/>
+              <w:end w:w="55" w:type="dxa"/>
             </w:tcMar>
           </w:tcPr>
           <w:p>
             <w:pPr>
-              <w:spacing w:before="0" w:after="0" w:line="216" w:lineRule="auto"/>
+              <w:spacing w:before="0" w:after="0" w:line="235" w:lineRule="auto"/>
               <w:jc w:val="left"/>
             </w:pPr>
-            <w:r/>
+            <w:r>
+              <w:rPr>
+                <w:sz w:val="15"/>
+              </w:rPr>
+            </w:r>
             <w:r>
               <w:rPr>
                 <w:rFonts w:ascii="Noto Sans CJK SC" w:hAnsi="Noto Sans CJK SC" w:eastAsia="Noto Sans CJK SC"/>
                 <w:b w:val="0"/>
                 <w:color w:val="1F2933"/>
-                <w:sz w:val="12"/>
+                <w:sz w:val="15"/>
               </w:rPr>
               <w:t>界面表/合同摘要</w:t>
             </w:r>
@@ -2548,13 +2885,13 @@
         <w:rPr>
           <w:b/>
           <w:color w:val="153E65"/>
-          <w:sz w:val="14"/>
+          <w:sz w:val="15"/>
         </w:rPr>
         <w:t>填表说明：</w:t>
       </w:r>
       <w:r>
         <w:rPr>
-          <w:sz w:val="14"/>
+          <w:sz w:val="15"/>
         </w:rPr>
         <w:t>优先提供电子台账，Excel保留原始字段、单位和时间粒度；涉密内容可打码。购电或权益合同若未覆盖本基地，须单列说明，不计入基地实绩。暂缺项请填“无/不适用/预计提供日期”；请于两周内先回传必收项，旧收支清单废止。</w:t>
       </w:r>

</xml_diff>